<commit_message>
Se modifico el Anexo
</commit_message>
<xml_diff>
--- a/1er entrega TPI - comision 1 grupo 5.docx
+++ b/1er entrega TPI - comision 1 grupo 5.docx
@@ -284,7 +284,23 @@
           <w:rFonts w:ascii="Arial" w:eastAsia="Arial" w:hAnsi="Arial" w:cs="Arial"/>
           <w:sz w:val="18"/>
         </w:rPr>
-        <w:t xml:space="preserve">Ing. Achetta Laura </w:t>
+        <w:t xml:space="preserve">Ing. </w:t>
+      </w:r>
+      <w:proofErr w:type="spellStart"/>
+      <w:r>
+        <w:rPr>
+          <w:rFonts w:ascii="Arial" w:eastAsia="Arial" w:hAnsi="Arial" w:cs="Arial"/>
+          <w:sz w:val="18"/>
+        </w:rPr>
+        <w:t>Achetta</w:t>
+      </w:r>
+      <w:proofErr w:type="spellEnd"/>
+      <w:r>
+        <w:rPr>
+          <w:rFonts w:ascii="Arial" w:eastAsia="Arial" w:hAnsi="Arial" w:cs="Arial"/>
+          <w:sz w:val="18"/>
+        </w:rPr>
+        <w:t xml:space="preserve"> Laura </w:t>
       </w:r>
     </w:p>
     <w:p>
@@ -462,12 +478,21 @@
           <w:rFonts w:ascii="Arial" w:hAnsi="Arial"/>
         </w:rPr>
       </w:pPr>
-      <w:r>
-        <w:rPr>
-          <w:rFonts w:ascii="Arial" w:eastAsia="Arial" w:hAnsi="Arial" w:cs="Arial"/>
-          <w:sz w:val="18"/>
-        </w:rPr>
-        <w:t xml:space="preserve">Rodriguez Dionisio </w:t>
+      <w:proofErr w:type="spellStart"/>
+      <w:r>
+        <w:rPr>
+          <w:rFonts w:ascii="Arial" w:eastAsia="Arial" w:hAnsi="Arial" w:cs="Arial"/>
+          <w:sz w:val="18"/>
+        </w:rPr>
+        <w:t>Rodriguez</w:t>
+      </w:r>
+      <w:proofErr w:type="spellEnd"/>
+      <w:r>
+        <w:rPr>
+          <w:rFonts w:ascii="Arial" w:eastAsia="Arial" w:hAnsi="Arial" w:cs="Arial"/>
+          <w:sz w:val="18"/>
+        </w:rPr>
+        <w:t xml:space="preserve"> Dionisio </w:t>
       </w:r>
       <w:r>
         <w:rPr>
@@ -747,12 +772,21 @@
           <w:rFonts w:ascii="Arial" w:hAnsi="Arial"/>
         </w:rPr>
       </w:pPr>
-      <w:r>
-        <w:rPr>
-          <w:rFonts w:ascii="Arial" w:eastAsia="Arial" w:hAnsi="Arial" w:cs="Arial"/>
-          <w:sz w:val="18"/>
-        </w:rPr>
-        <w:t xml:space="preserve">Cuassolo Octavio                                                                        </w:t>
+      <w:proofErr w:type="spellStart"/>
+      <w:r>
+        <w:rPr>
+          <w:rFonts w:ascii="Arial" w:eastAsia="Arial" w:hAnsi="Arial" w:cs="Arial"/>
+          <w:sz w:val="18"/>
+        </w:rPr>
+        <w:t>Cuassolo</w:t>
+      </w:r>
+      <w:proofErr w:type="spellEnd"/>
+      <w:r>
+        <w:rPr>
+          <w:rFonts w:ascii="Arial" w:eastAsia="Arial" w:hAnsi="Arial" w:cs="Arial"/>
+          <w:sz w:val="18"/>
+        </w:rPr>
+        <w:t xml:space="preserve"> Octavio                                                                        </w:t>
       </w:r>
       <w:r>
         <w:rPr>
@@ -877,7 +911,6 @@
           <w:rFonts w:ascii="Arial" w:eastAsia="Arial" w:hAnsi="Arial" w:cs="Arial"/>
           <w:sz w:val="18"/>
         </w:rPr>
-        <w:lastRenderedPageBreak/>
         <w:t xml:space="preserve"> </w:t>
       </w:r>
     </w:p>
@@ -1269,7 +1302,23 @@
           <w:rFonts w:ascii="Arial" w:eastAsia="Arial" w:hAnsi="Arial" w:cs="Arial"/>
           <w:szCs w:val="22"/>
         </w:rPr>
-        <w:t>Somos Omicron Dev, un equipo dedicado a la ingeniería en sistemas de información. Nuestro principal servicio es el análisis, diseño y desarrollo de soluciones de software para clientes particulares, pequeñas empresas y medianas organizaciones que necesiten mejorar la forma en que gestionan su información.</w:t>
+        <w:t xml:space="preserve">Somos </w:t>
+      </w:r>
+      <w:proofErr w:type="spellStart"/>
+      <w:r>
+        <w:rPr>
+          <w:rFonts w:ascii="Arial" w:eastAsia="Arial" w:hAnsi="Arial" w:cs="Arial"/>
+          <w:szCs w:val="22"/>
+        </w:rPr>
+        <w:t>Omicron</w:t>
+      </w:r>
+      <w:proofErr w:type="spellEnd"/>
+      <w:r>
+        <w:rPr>
+          <w:rFonts w:ascii="Arial" w:eastAsia="Arial" w:hAnsi="Arial" w:cs="Arial"/>
+          <w:szCs w:val="22"/>
+        </w:rPr>
+        <w:t xml:space="preserve"> Dev, un equipo dedicado a la ingeniería en sistemas de información. Nuestro principal servicio es el análisis, diseño y desarrollo de soluciones de software para clientes particulares, pequeñas empresas y medianas organizaciones que necesiten mejorar la forma en que gestionan su información.</w:t>
       </w:r>
     </w:p>
     <w:p>
@@ -1425,7 +1474,49 @@
         <w:rPr>
           <w:rFonts w:ascii="Arial" w:eastAsia="Arial" w:hAnsi="Arial" w:cs="Arial"/>
         </w:rPr>
-        <w:t>De cada retiro, se tiene que registrar un estado que permita saber la situación en la que se encuentra: si el retiro solo resulta de interés, si ya fue consultado, si se está esperando una respuesta, si está reservado, si fue señado, sí está confirmado, cancelado o finalizado. Una vez finalizado un retiro, la aplicación tiene que permitir guardar la experiencia personal del usuario, incluyendo una valoración, comentarios, fotos, observaciones y una opinion del retiro. La opinion se podrá usar despues para recordar la experiencia o compartirla con otras personas.</w:t>
+        <w:t xml:space="preserve">De cada retiro, se tiene que registrar un estado que permita saber la situación en la que se encuentra: si el retiro solo resulta de interés, si ya fue consultado, si se está esperando una respuesta, si está reservado, si fue señado, sí está confirmado, cancelado o finalizado. Una vez finalizado un retiro, la aplicación tiene que permitir guardar la experiencia personal del usuario, incluyendo una valoración, comentarios, fotos, observaciones y una </w:t>
+      </w:r>
+      <w:proofErr w:type="spellStart"/>
+      <w:r>
+        <w:rPr>
+          <w:rFonts w:ascii="Arial" w:eastAsia="Arial" w:hAnsi="Arial" w:cs="Arial"/>
+        </w:rPr>
+        <w:t>opinion</w:t>
+      </w:r>
+      <w:proofErr w:type="spellEnd"/>
+      <w:r>
+        <w:rPr>
+          <w:rFonts w:ascii="Arial" w:eastAsia="Arial" w:hAnsi="Arial" w:cs="Arial"/>
+        </w:rPr>
+        <w:t xml:space="preserve"> del retiro. La </w:t>
+      </w:r>
+      <w:proofErr w:type="spellStart"/>
+      <w:r>
+        <w:rPr>
+          <w:rFonts w:ascii="Arial" w:eastAsia="Arial" w:hAnsi="Arial" w:cs="Arial"/>
+        </w:rPr>
+        <w:t>opinion</w:t>
+      </w:r>
+      <w:proofErr w:type="spellEnd"/>
+      <w:r>
+        <w:rPr>
+          <w:rFonts w:ascii="Arial" w:eastAsia="Arial" w:hAnsi="Arial" w:cs="Arial"/>
+        </w:rPr>
+        <w:t xml:space="preserve"> se podrá usar </w:t>
+      </w:r>
+      <w:proofErr w:type="spellStart"/>
+      <w:r>
+        <w:rPr>
+          <w:rFonts w:ascii="Arial" w:eastAsia="Arial" w:hAnsi="Arial" w:cs="Arial"/>
+        </w:rPr>
+        <w:t>despues</w:t>
+      </w:r>
+      <w:proofErr w:type="spellEnd"/>
+      <w:r>
+        <w:rPr>
+          <w:rFonts w:ascii="Arial" w:eastAsia="Arial" w:hAnsi="Arial" w:cs="Arial"/>
+        </w:rPr>
+        <w:t xml:space="preserve"> para recordar la experiencia o compartirla con otras personas.</w:t>
       </w:r>
     </w:p>
     <w:p>
@@ -1924,7 +2015,21 @@
         <w:rPr>
           <w:rFonts w:ascii="Arial" w:eastAsia="Arial" w:hAnsi="Arial" w:cs="Arial"/>
         </w:rPr>
-        <w:t>: El sistema debe integrarse con la API de Google Maps para mostrar la ubicación exacta del retiro y permitir el trazado de rutas desde la ubicación del usuario.</w:t>
+        <w:t xml:space="preserve">: El sistema debe integrarse con la API de Google </w:t>
+      </w:r>
+      <w:proofErr w:type="spellStart"/>
+      <w:r>
+        <w:rPr>
+          <w:rFonts w:ascii="Arial" w:eastAsia="Arial" w:hAnsi="Arial" w:cs="Arial"/>
+        </w:rPr>
+        <w:t>Maps</w:t>
+      </w:r>
+      <w:proofErr w:type="spellEnd"/>
+      <w:r>
+        <w:rPr>
+          <w:rFonts w:ascii="Arial" w:eastAsia="Arial" w:hAnsi="Arial" w:cs="Arial"/>
+        </w:rPr>
+        <w:t xml:space="preserve"> para mostrar la ubicación exacta del retiro y permitir el trazado de rutas desde la ubicación del usuario.</w:t>
       </w:r>
     </w:p>
     <w:p>
@@ -2074,7 +2179,21 @@
         <w:rPr>
           <w:rFonts w:ascii="Arial" w:eastAsia="Arial" w:hAnsi="Arial" w:cs="Arial"/>
         </w:rPr>
-        <w:t>: El sistema debe permitir el registro, inicio de sesión (login) y recuperación de contraseña para los usuarios.</w:t>
+        <w:t>: El sistema debe permitir el registro, inicio de sesión (</w:t>
+      </w:r>
+      <w:proofErr w:type="spellStart"/>
+      <w:r>
+        <w:rPr>
+          <w:rFonts w:ascii="Arial" w:eastAsia="Arial" w:hAnsi="Arial" w:cs="Arial"/>
+        </w:rPr>
+        <w:t>login</w:t>
+      </w:r>
+      <w:proofErr w:type="spellEnd"/>
+      <w:r>
+        <w:rPr>
+          <w:rFonts w:ascii="Arial" w:eastAsia="Arial" w:hAnsi="Arial" w:cs="Arial"/>
+        </w:rPr>
+        <w:t>) y recuperación de contraseña para los usuarios.</w:t>
       </w:r>
     </w:p>
     <w:p>
@@ -2096,13 +2215,465 @@
       <w:pPr>
         <w:spacing w:after="0" w:line="240" w:lineRule="auto"/>
         <w:ind w:left="-5" w:hanging="10"/>
-      </w:pPr>
-      <w:r>
         <w:rPr>
           <w:rFonts w:ascii="Arial" w:eastAsia="Arial" w:hAnsi="Arial" w:cs="Arial"/>
           <w:sz w:val="18"/>
           <w:shd w:val="clear" w:color="auto" w:fill="FFFF00"/>
         </w:rPr>
+      </w:pPr>
+    </w:p>
+    <w:p>
+      <w:pPr>
+        <w:spacing w:after="0" w:line="240" w:lineRule="auto"/>
+        <w:ind w:left="-5" w:hanging="10"/>
+        <w:rPr>
+          <w:rFonts w:ascii="Arial" w:eastAsia="Arial" w:hAnsi="Arial" w:cs="Arial"/>
+          <w:sz w:val="18"/>
+          <w:shd w:val="clear" w:color="auto" w:fill="FFFF00"/>
+        </w:rPr>
+      </w:pPr>
+    </w:p>
+    <w:p>
+      <w:pPr>
+        <w:spacing w:after="0" w:line="240" w:lineRule="auto"/>
+        <w:ind w:left="-5" w:hanging="10"/>
+        <w:rPr>
+          <w:rFonts w:ascii="Arial" w:eastAsia="Arial" w:hAnsi="Arial" w:cs="Arial"/>
+          <w:sz w:val="18"/>
+          <w:shd w:val="clear" w:color="auto" w:fill="FFFF00"/>
+        </w:rPr>
+      </w:pPr>
+    </w:p>
+    <w:p>
+      <w:pPr>
+        <w:spacing w:after="0" w:line="240" w:lineRule="auto"/>
+        <w:ind w:left="-5" w:hanging="10"/>
+        <w:rPr>
+          <w:rFonts w:ascii="Arial" w:eastAsia="Arial" w:hAnsi="Arial" w:cs="Arial"/>
+          <w:sz w:val="18"/>
+          <w:shd w:val="clear" w:color="auto" w:fill="FFFF00"/>
+        </w:rPr>
+      </w:pPr>
+    </w:p>
+    <w:p>
+      <w:pPr>
+        <w:spacing w:after="0" w:line="240" w:lineRule="auto"/>
+        <w:ind w:left="-5" w:hanging="10"/>
+        <w:rPr>
+          <w:rFonts w:ascii="Arial" w:eastAsia="Arial" w:hAnsi="Arial" w:cs="Arial"/>
+          <w:sz w:val="18"/>
+          <w:shd w:val="clear" w:color="auto" w:fill="FFFF00"/>
+        </w:rPr>
+      </w:pPr>
+    </w:p>
+    <w:p>
+      <w:pPr>
+        <w:spacing w:after="0" w:line="240" w:lineRule="auto"/>
+        <w:ind w:left="-5" w:hanging="10"/>
+        <w:rPr>
+          <w:rFonts w:ascii="Arial" w:eastAsia="Arial" w:hAnsi="Arial" w:cs="Arial"/>
+          <w:sz w:val="18"/>
+          <w:shd w:val="clear" w:color="auto" w:fill="FFFF00"/>
+        </w:rPr>
+      </w:pPr>
+    </w:p>
+    <w:p>
+      <w:pPr>
+        <w:spacing w:after="0" w:line="240" w:lineRule="auto"/>
+        <w:ind w:left="-5" w:hanging="10"/>
+        <w:rPr>
+          <w:rFonts w:ascii="Arial" w:eastAsia="Arial" w:hAnsi="Arial" w:cs="Arial"/>
+          <w:sz w:val="18"/>
+          <w:shd w:val="clear" w:color="auto" w:fill="FFFF00"/>
+        </w:rPr>
+      </w:pPr>
+    </w:p>
+    <w:p>
+      <w:pPr>
+        <w:spacing w:after="0" w:line="240" w:lineRule="auto"/>
+        <w:ind w:left="-5" w:hanging="10"/>
+        <w:rPr>
+          <w:rFonts w:ascii="Arial" w:eastAsia="Arial" w:hAnsi="Arial" w:cs="Arial"/>
+          <w:sz w:val="18"/>
+          <w:shd w:val="clear" w:color="auto" w:fill="FFFF00"/>
+        </w:rPr>
+      </w:pPr>
+    </w:p>
+    <w:p>
+      <w:pPr>
+        <w:spacing w:after="0" w:line="240" w:lineRule="auto"/>
+        <w:ind w:left="-5" w:hanging="10"/>
+        <w:rPr>
+          <w:rFonts w:ascii="Arial" w:eastAsia="Arial" w:hAnsi="Arial" w:cs="Arial"/>
+          <w:sz w:val="18"/>
+          <w:shd w:val="clear" w:color="auto" w:fill="FFFF00"/>
+        </w:rPr>
+      </w:pPr>
+    </w:p>
+    <w:p>
+      <w:pPr>
+        <w:spacing w:after="0" w:line="240" w:lineRule="auto"/>
+        <w:ind w:left="-5" w:hanging="10"/>
+        <w:rPr>
+          <w:rFonts w:ascii="Arial" w:eastAsia="Arial" w:hAnsi="Arial" w:cs="Arial"/>
+          <w:sz w:val="18"/>
+          <w:shd w:val="clear" w:color="auto" w:fill="FFFF00"/>
+        </w:rPr>
+      </w:pPr>
+    </w:p>
+    <w:p>
+      <w:pPr>
+        <w:spacing w:after="0" w:line="240" w:lineRule="auto"/>
+        <w:ind w:left="-5" w:hanging="10"/>
+        <w:rPr>
+          <w:rFonts w:ascii="Arial" w:eastAsia="Arial" w:hAnsi="Arial" w:cs="Arial"/>
+          <w:sz w:val="18"/>
+          <w:shd w:val="clear" w:color="auto" w:fill="FFFF00"/>
+        </w:rPr>
+      </w:pPr>
+    </w:p>
+    <w:p>
+      <w:pPr>
+        <w:spacing w:after="0" w:line="240" w:lineRule="auto"/>
+        <w:ind w:left="-5" w:hanging="10"/>
+        <w:rPr>
+          <w:rFonts w:ascii="Arial" w:eastAsia="Arial" w:hAnsi="Arial" w:cs="Arial"/>
+          <w:sz w:val="18"/>
+          <w:shd w:val="clear" w:color="auto" w:fill="FFFF00"/>
+        </w:rPr>
+      </w:pPr>
+    </w:p>
+    <w:p>
+      <w:pPr>
+        <w:spacing w:after="0" w:line="240" w:lineRule="auto"/>
+        <w:ind w:left="-5" w:hanging="10"/>
+        <w:rPr>
+          <w:rFonts w:ascii="Arial" w:eastAsia="Arial" w:hAnsi="Arial" w:cs="Arial"/>
+          <w:sz w:val="18"/>
+          <w:shd w:val="clear" w:color="auto" w:fill="FFFF00"/>
+        </w:rPr>
+      </w:pPr>
+    </w:p>
+    <w:p>
+      <w:pPr>
+        <w:spacing w:after="0" w:line="240" w:lineRule="auto"/>
+        <w:ind w:left="-5" w:hanging="10"/>
+        <w:rPr>
+          <w:rFonts w:ascii="Arial" w:eastAsia="Arial" w:hAnsi="Arial" w:cs="Arial"/>
+          <w:sz w:val="18"/>
+          <w:shd w:val="clear" w:color="auto" w:fill="FFFF00"/>
+        </w:rPr>
+      </w:pPr>
+    </w:p>
+    <w:p>
+      <w:pPr>
+        <w:spacing w:after="0" w:line="240" w:lineRule="auto"/>
+        <w:ind w:left="-5" w:hanging="10"/>
+        <w:rPr>
+          <w:rFonts w:ascii="Arial" w:eastAsia="Arial" w:hAnsi="Arial" w:cs="Arial"/>
+          <w:sz w:val="18"/>
+          <w:shd w:val="clear" w:color="auto" w:fill="FFFF00"/>
+        </w:rPr>
+      </w:pPr>
+    </w:p>
+    <w:p>
+      <w:pPr>
+        <w:spacing w:after="0" w:line="240" w:lineRule="auto"/>
+        <w:ind w:left="-5" w:hanging="10"/>
+        <w:rPr>
+          <w:rFonts w:ascii="Arial" w:eastAsia="Arial" w:hAnsi="Arial" w:cs="Arial"/>
+          <w:sz w:val="18"/>
+          <w:shd w:val="clear" w:color="auto" w:fill="FFFF00"/>
+        </w:rPr>
+      </w:pPr>
+    </w:p>
+    <w:p>
+      <w:pPr>
+        <w:spacing w:after="0" w:line="240" w:lineRule="auto"/>
+        <w:ind w:left="-5" w:hanging="10"/>
+        <w:rPr>
+          <w:rFonts w:ascii="Arial" w:eastAsia="Arial" w:hAnsi="Arial" w:cs="Arial"/>
+          <w:sz w:val="18"/>
+          <w:shd w:val="clear" w:color="auto" w:fill="FFFF00"/>
+        </w:rPr>
+      </w:pPr>
+    </w:p>
+    <w:p>
+      <w:pPr>
+        <w:spacing w:after="0" w:line="240" w:lineRule="auto"/>
+        <w:ind w:left="-5" w:hanging="10"/>
+        <w:rPr>
+          <w:rFonts w:ascii="Arial" w:eastAsia="Arial" w:hAnsi="Arial" w:cs="Arial"/>
+          <w:sz w:val="18"/>
+          <w:shd w:val="clear" w:color="auto" w:fill="FFFF00"/>
+        </w:rPr>
+      </w:pPr>
+    </w:p>
+    <w:p>
+      <w:pPr>
+        <w:spacing w:after="0" w:line="240" w:lineRule="auto"/>
+        <w:ind w:left="-5" w:hanging="10"/>
+        <w:rPr>
+          <w:rFonts w:ascii="Arial" w:eastAsia="Arial" w:hAnsi="Arial" w:cs="Arial"/>
+          <w:sz w:val="18"/>
+          <w:shd w:val="clear" w:color="auto" w:fill="FFFF00"/>
+        </w:rPr>
+      </w:pPr>
+    </w:p>
+    <w:p>
+      <w:pPr>
+        <w:spacing w:after="0" w:line="240" w:lineRule="auto"/>
+        <w:ind w:left="-5" w:hanging="10"/>
+        <w:rPr>
+          <w:rFonts w:ascii="Arial" w:eastAsia="Arial" w:hAnsi="Arial" w:cs="Arial"/>
+          <w:sz w:val="18"/>
+          <w:shd w:val="clear" w:color="auto" w:fill="FFFF00"/>
+        </w:rPr>
+      </w:pPr>
+    </w:p>
+    <w:p>
+      <w:pPr>
+        <w:spacing w:after="0" w:line="240" w:lineRule="auto"/>
+        <w:ind w:left="-5" w:hanging="10"/>
+        <w:rPr>
+          <w:rFonts w:ascii="Arial" w:eastAsia="Arial" w:hAnsi="Arial" w:cs="Arial"/>
+          <w:sz w:val="18"/>
+          <w:shd w:val="clear" w:color="auto" w:fill="FFFF00"/>
+        </w:rPr>
+      </w:pPr>
+    </w:p>
+    <w:p>
+      <w:pPr>
+        <w:spacing w:after="0" w:line="240" w:lineRule="auto"/>
+        <w:ind w:left="-5" w:hanging="10"/>
+        <w:rPr>
+          <w:rFonts w:ascii="Arial" w:eastAsia="Arial" w:hAnsi="Arial" w:cs="Arial"/>
+          <w:sz w:val="18"/>
+          <w:shd w:val="clear" w:color="auto" w:fill="FFFF00"/>
+        </w:rPr>
+      </w:pPr>
+    </w:p>
+    <w:p>
+      <w:pPr>
+        <w:spacing w:after="0" w:line="240" w:lineRule="auto"/>
+        <w:ind w:left="-5" w:hanging="10"/>
+        <w:rPr>
+          <w:rFonts w:ascii="Arial" w:eastAsia="Arial" w:hAnsi="Arial" w:cs="Arial"/>
+          <w:sz w:val="18"/>
+          <w:shd w:val="clear" w:color="auto" w:fill="FFFF00"/>
+        </w:rPr>
+      </w:pPr>
+    </w:p>
+    <w:p>
+      <w:pPr>
+        <w:spacing w:after="0" w:line="240" w:lineRule="auto"/>
+        <w:ind w:left="-5" w:hanging="10"/>
+        <w:rPr>
+          <w:rFonts w:ascii="Arial" w:eastAsia="Arial" w:hAnsi="Arial" w:cs="Arial"/>
+          <w:sz w:val="18"/>
+          <w:shd w:val="clear" w:color="auto" w:fill="FFFF00"/>
+        </w:rPr>
+      </w:pPr>
+    </w:p>
+    <w:p>
+      <w:pPr>
+        <w:spacing w:after="0" w:line="240" w:lineRule="auto"/>
+        <w:ind w:left="-5" w:hanging="10"/>
+        <w:rPr>
+          <w:rFonts w:ascii="Arial" w:eastAsia="Arial" w:hAnsi="Arial" w:cs="Arial"/>
+          <w:sz w:val="18"/>
+          <w:shd w:val="clear" w:color="auto" w:fill="FFFF00"/>
+        </w:rPr>
+      </w:pPr>
+    </w:p>
+    <w:p>
+      <w:pPr>
+        <w:spacing w:after="0" w:line="240" w:lineRule="auto"/>
+        <w:ind w:left="-5" w:hanging="10"/>
+        <w:rPr>
+          <w:rFonts w:ascii="Arial" w:eastAsia="Arial" w:hAnsi="Arial" w:cs="Arial"/>
+          <w:sz w:val="18"/>
+          <w:shd w:val="clear" w:color="auto" w:fill="FFFF00"/>
+        </w:rPr>
+      </w:pPr>
+    </w:p>
+    <w:p>
+      <w:pPr>
+        <w:spacing w:after="0" w:line="240" w:lineRule="auto"/>
+        <w:ind w:left="-5" w:hanging="10"/>
+        <w:rPr>
+          <w:rFonts w:ascii="Arial" w:eastAsia="Arial" w:hAnsi="Arial" w:cs="Arial"/>
+          <w:sz w:val="18"/>
+          <w:shd w:val="clear" w:color="auto" w:fill="FFFF00"/>
+        </w:rPr>
+      </w:pPr>
+    </w:p>
+    <w:p>
+      <w:pPr>
+        <w:spacing w:after="0" w:line="240" w:lineRule="auto"/>
+        <w:ind w:left="-5" w:hanging="10"/>
+        <w:rPr>
+          <w:rFonts w:ascii="Arial" w:eastAsia="Arial" w:hAnsi="Arial" w:cs="Arial"/>
+          <w:sz w:val="18"/>
+          <w:shd w:val="clear" w:color="auto" w:fill="FFFF00"/>
+        </w:rPr>
+      </w:pPr>
+    </w:p>
+    <w:p>
+      <w:pPr>
+        <w:spacing w:after="0" w:line="240" w:lineRule="auto"/>
+        <w:ind w:left="-5" w:hanging="10"/>
+        <w:rPr>
+          <w:rFonts w:ascii="Arial" w:eastAsia="Arial" w:hAnsi="Arial" w:cs="Arial"/>
+          <w:sz w:val="18"/>
+          <w:shd w:val="clear" w:color="auto" w:fill="FFFF00"/>
+        </w:rPr>
+      </w:pPr>
+    </w:p>
+    <w:p>
+      <w:pPr>
+        <w:spacing w:after="0" w:line="240" w:lineRule="auto"/>
+        <w:ind w:left="-5" w:hanging="10"/>
+        <w:rPr>
+          <w:rFonts w:ascii="Arial" w:eastAsia="Arial" w:hAnsi="Arial" w:cs="Arial"/>
+          <w:sz w:val="18"/>
+          <w:shd w:val="clear" w:color="auto" w:fill="FFFF00"/>
+        </w:rPr>
+      </w:pPr>
+    </w:p>
+    <w:p>
+      <w:pPr>
+        <w:spacing w:after="0" w:line="240" w:lineRule="auto"/>
+        <w:ind w:left="-5" w:hanging="10"/>
+        <w:rPr>
+          <w:rFonts w:ascii="Arial" w:eastAsia="Arial" w:hAnsi="Arial" w:cs="Arial"/>
+          <w:sz w:val="18"/>
+          <w:shd w:val="clear" w:color="auto" w:fill="FFFF00"/>
+        </w:rPr>
+      </w:pPr>
+    </w:p>
+    <w:p>
+      <w:pPr>
+        <w:spacing w:after="0" w:line="240" w:lineRule="auto"/>
+        <w:ind w:left="-5" w:hanging="10"/>
+        <w:rPr>
+          <w:rFonts w:ascii="Arial" w:eastAsia="Arial" w:hAnsi="Arial" w:cs="Arial"/>
+          <w:sz w:val="18"/>
+          <w:shd w:val="clear" w:color="auto" w:fill="FFFF00"/>
+        </w:rPr>
+      </w:pPr>
+    </w:p>
+    <w:p>
+      <w:pPr>
+        <w:spacing w:after="0" w:line="240" w:lineRule="auto"/>
+        <w:ind w:left="-5" w:hanging="10"/>
+        <w:rPr>
+          <w:rFonts w:ascii="Arial" w:eastAsia="Arial" w:hAnsi="Arial" w:cs="Arial"/>
+          <w:sz w:val="18"/>
+          <w:shd w:val="clear" w:color="auto" w:fill="FFFF00"/>
+        </w:rPr>
+      </w:pPr>
+    </w:p>
+    <w:p>
+      <w:pPr>
+        <w:spacing w:after="0" w:line="240" w:lineRule="auto"/>
+        <w:ind w:left="-5" w:hanging="10"/>
+        <w:rPr>
+          <w:rFonts w:ascii="Arial" w:eastAsia="Arial" w:hAnsi="Arial" w:cs="Arial"/>
+          <w:sz w:val="18"/>
+          <w:shd w:val="clear" w:color="auto" w:fill="FFFF00"/>
+        </w:rPr>
+      </w:pPr>
+    </w:p>
+    <w:p>
+      <w:pPr>
+        <w:spacing w:after="0" w:line="240" w:lineRule="auto"/>
+        <w:ind w:left="-5" w:hanging="10"/>
+        <w:rPr>
+          <w:rFonts w:ascii="Arial" w:eastAsia="Arial" w:hAnsi="Arial" w:cs="Arial"/>
+          <w:sz w:val="18"/>
+          <w:shd w:val="clear" w:color="auto" w:fill="FFFF00"/>
+        </w:rPr>
+      </w:pPr>
+    </w:p>
+    <w:p>
+      <w:pPr>
+        <w:spacing w:after="0" w:line="240" w:lineRule="auto"/>
+        <w:ind w:left="-5" w:hanging="10"/>
+        <w:rPr>
+          <w:rFonts w:ascii="Arial" w:eastAsia="Arial" w:hAnsi="Arial" w:cs="Arial"/>
+          <w:sz w:val="18"/>
+          <w:shd w:val="clear" w:color="auto" w:fill="FFFF00"/>
+        </w:rPr>
+      </w:pPr>
+    </w:p>
+    <w:p>
+      <w:pPr>
+        <w:spacing w:after="0" w:line="240" w:lineRule="auto"/>
+        <w:ind w:left="-5" w:hanging="10"/>
+        <w:rPr>
+          <w:rFonts w:ascii="Arial" w:eastAsia="Arial" w:hAnsi="Arial" w:cs="Arial"/>
+          <w:sz w:val="18"/>
+          <w:shd w:val="clear" w:color="auto" w:fill="FFFF00"/>
+        </w:rPr>
+      </w:pPr>
+    </w:p>
+    <w:p>
+      <w:pPr>
+        <w:spacing w:after="0" w:line="240" w:lineRule="auto"/>
+        <w:ind w:left="-5" w:hanging="10"/>
+        <w:rPr>
+          <w:rFonts w:ascii="Arial" w:eastAsia="Arial" w:hAnsi="Arial" w:cs="Arial"/>
+          <w:sz w:val="18"/>
+          <w:shd w:val="clear" w:color="auto" w:fill="FFFF00"/>
+        </w:rPr>
+      </w:pPr>
+    </w:p>
+    <w:p>
+      <w:pPr>
+        <w:spacing w:after="0" w:line="240" w:lineRule="auto"/>
+        <w:ind w:left="-5" w:hanging="10"/>
+        <w:rPr>
+          <w:rFonts w:ascii="Arial" w:eastAsia="Arial" w:hAnsi="Arial" w:cs="Arial"/>
+          <w:sz w:val="18"/>
+          <w:shd w:val="clear" w:color="auto" w:fill="FFFF00"/>
+        </w:rPr>
+      </w:pPr>
+    </w:p>
+    <w:p>
+      <w:pPr>
+        <w:spacing w:after="0" w:line="240" w:lineRule="auto"/>
+        <w:ind w:left="-5" w:hanging="10"/>
+        <w:rPr>
+          <w:rFonts w:ascii="Arial" w:eastAsia="Arial" w:hAnsi="Arial" w:cs="Arial"/>
+          <w:sz w:val="18"/>
+          <w:shd w:val="clear" w:color="auto" w:fill="FFFF00"/>
+        </w:rPr>
+      </w:pPr>
+    </w:p>
+    <w:p>
+      <w:pPr>
+        <w:spacing w:after="0" w:line="240" w:lineRule="auto"/>
+        <w:ind w:left="-5" w:hanging="10"/>
+        <w:rPr>
+          <w:rFonts w:ascii="Arial" w:eastAsia="Arial" w:hAnsi="Arial" w:cs="Arial"/>
+          <w:sz w:val="18"/>
+          <w:shd w:val="clear" w:color="auto" w:fill="FFFF00"/>
+        </w:rPr>
+      </w:pPr>
+    </w:p>
+    <w:p>
+      <w:pPr>
+        <w:spacing w:after="0" w:line="240" w:lineRule="auto"/>
+        <w:ind w:left="-5" w:hanging="10"/>
+      </w:pPr>
+      <w:r>
+        <w:rPr>
+          <w:rFonts w:ascii="Arial" w:eastAsia="Arial" w:hAnsi="Arial" w:cs="Arial"/>
+          <w:sz w:val="18"/>
+          <w:shd w:val="clear" w:color="auto" w:fill="FFFF00"/>
+        </w:rPr>
+        <w:lastRenderedPageBreak/>
         <w:t>4) Anexo: coloca imágenes de las páginas, links consultados para la</w:t>
       </w:r>
       <w:hyperlink r:id="rId9">
@@ -2155,22 +2726,7 @@
           <w:rFonts w:ascii="Arial" w:eastAsia="Arial" w:hAnsi="Arial" w:cs="Arial"/>
           <w:sz w:val="18"/>
         </w:rPr>
-        <w:t xml:space="preserve"> </w:t>
-      </w:r>
-    </w:p>
-    <w:p>
-      <w:pPr>
-        <w:spacing w:after="623" w:line="240" w:lineRule="auto"/>
-        <w:rPr>
-          <w:rFonts w:ascii="Arial" w:hAnsi="Arial"/>
-        </w:rPr>
-      </w:pPr>
-      <w:r>
-        <w:rPr>
-          <w:rFonts w:ascii="Arial" w:eastAsia="Arial" w:hAnsi="Arial" w:cs="Arial"/>
-          <w:sz w:val="18"/>
-        </w:rPr>
-        <w:t xml:space="preserve"> </w:t>
+        <w:t xml:space="preserve">  </w:t>
       </w:r>
     </w:p>
     <w:p>
@@ -2216,7 +2772,21 @@
           <w:rFonts w:ascii="Arial" w:eastAsia="Arial" w:hAnsi="Arial" w:cs="Arial"/>
           <w:sz w:val="26"/>
         </w:rPr>
-        <w:t>Links de paginas visitadas:</w:t>
+        <w:t xml:space="preserve">Links de </w:t>
+      </w:r>
+      <w:r>
+        <w:rPr>
+          <w:rFonts w:ascii="Arial" w:eastAsia="Arial" w:hAnsi="Arial" w:cs="Arial"/>
+          <w:sz w:val="26"/>
+        </w:rPr>
+        <w:t>páginas</w:t>
+      </w:r>
+      <w:r>
+        <w:rPr>
+          <w:rFonts w:ascii="Arial" w:eastAsia="Arial" w:hAnsi="Arial" w:cs="Arial"/>
+          <w:sz w:val="26"/>
+        </w:rPr>
+        <w:t xml:space="preserve"> visitadas:</w:t>
       </w:r>
       <w:r>
         <w:rPr>
@@ -2264,7 +2834,25 @@
             <w:sz w:val="18"/>
             <w:u w:val="single" w:color="1155CC"/>
           </w:rPr>
-          <w:t>https://denisecosentino.com/retiro-magico/</w:t>
+          <w:t>https://</w:t>
+        </w:r>
+        <w:r>
+          <w:rPr>
+            <w:rFonts w:ascii="Arial" w:eastAsia="Arial" w:hAnsi="Arial" w:cs="Arial"/>
+            <w:color w:val="1155CC"/>
+            <w:sz w:val="18"/>
+            <w:u w:val="single" w:color="1155CC"/>
+          </w:rPr>
+          <w:t>d</w:t>
+        </w:r>
+        <w:r>
+          <w:rPr>
+            <w:rFonts w:ascii="Arial" w:eastAsia="Arial" w:hAnsi="Arial" w:cs="Arial"/>
+            <w:color w:val="1155CC"/>
+            <w:sz w:val="18"/>
+            <w:u w:val="single" w:color="1155CC"/>
+          </w:rPr>
+          <w:t>enisecosentino.com/retiro-magico/</w:t>
         </w:r>
       </w:hyperlink>
       <w:r>
@@ -2277,22 +2865,6 @@
     </w:p>
     <w:p>
       <w:pPr>
-        <w:spacing w:after="0" w:line="240" w:lineRule="auto"/>
-        <w:ind w:left="-5" w:hanging="10"/>
-        <w:rPr>
-          <w:rFonts w:ascii="Arial" w:hAnsi="Arial"/>
-        </w:rPr>
-      </w:pPr>
-      <w:r>
-        <w:rPr>
-          <w:rFonts w:ascii="Arial" w:eastAsia="Arial" w:hAnsi="Arial" w:cs="Arial"/>
-          <w:sz w:val="18"/>
-        </w:rPr>
-        <w:t xml:space="preserve">Ofrece un listado de las actividades que se realizan por dia: </w:t>
-      </w:r>
-    </w:p>
-    <w:p>
-      <w:pPr>
         <w:spacing w:after="141" w:line="240" w:lineRule="auto"/>
         <w:ind w:right="-30"/>
         <w:rPr>
@@ -2301,18 +2873,93 @@
       </w:pPr>
       <w:r>
         <w:rPr>
-          <w:noProof/>
-        </w:rPr>
+          <w:rFonts w:ascii="Arial" w:eastAsia="Arial" w:hAnsi="Arial" w:cs="Arial"/>
+          <w:sz w:val="18"/>
+        </w:rPr>
+        <w:t xml:space="preserve">Se relevó la existencia de un cronograma diario que detalla las actividades a realizar durante cada jornada del retiro, información que resulta relevante para el registro y consulta de actividades </w:t>
+      </w:r>
+      <w:proofErr w:type="spellStart"/>
+      <w:r>
+        <w:rPr>
+          <w:rFonts w:ascii="Arial" w:eastAsia="Arial" w:hAnsi="Arial" w:cs="Arial"/>
+          <w:sz w:val="18"/>
+        </w:rPr>
+        <w:t>dentro</w:t>
+      </w:r>
+      <w:r>
+        <w:rPr>
+          <w:rFonts w:ascii="Arial" w:eastAsia="Arial" w:hAnsi="Arial" w:cs="Arial"/>
+          <w:sz w:val="18"/>
+        </w:rPr>
+        <w:t>del</w:t>
+      </w:r>
+      <w:proofErr w:type="spellEnd"/>
+      <w:r>
+        <w:rPr>
+          <w:rFonts w:ascii="Arial" w:eastAsia="Arial" w:hAnsi="Arial" w:cs="Arial"/>
+          <w:sz w:val="18"/>
+        </w:rPr>
+        <w:t xml:space="preserve"> sistema </w:t>
+      </w:r>
+      <w:r>
+        <w:drawing>
+          <wp:inline distT="0" distB="0" distL="0" distR="0" wp14:anchorId="1230166A" wp14:editId="14B20C1F">
+            <wp:extent cx="5795010" cy="5468620"/>
+            <wp:effectExtent l="0" t="0" r="0" b="0"/>
+            <wp:docPr id="894519973" name="Imagen 1"/>
+            <wp:cNvGraphicFramePr>
+              <a:graphicFrameLocks xmlns:a="http://schemas.openxmlformats.org/drawingml/2006/main" noChangeAspect="1"/>
+            </wp:cNvGraphicFramePr>
+            <a:graphic xmlns:a="http://schemas.openxmlformats.org/drawingml/2006/main">
+              <a:graphicData uri="http://schemas.openxmlformats.org/drawingml/2006/picture">
+                <pic:pic xmlns:pic="http://schemas.openxmlformats.org/drawingml/2006/picture">
+                  <pic:nvPicPr>
+                    <pic:cNvPr id="0" name="Picture 20"/>
+                    <pic:cNvPicPr>
+                      <a:picLocks noChangeAspect="1" noChangeArrowheads="1"/>
+                    </pic:cNvPicPr>
+                  </pic:nvPicPr>
+                  <pic:blipFill>
+                    <a:blip r:embed="rId12">
+                      <a:extLst>
+                        <a:ext uri="{28A0092B-C50C-407E-A947-70E740481C1C}">
+                          <a14:useLocalDpi xmlns:a14="http://schemas.microsoft.com/office/drawing/2010/main" val="0"/>
+                        </a:ext>
+                      </a:extLst>
+                    </a:blip>
+                    <a:srcRect/>
+                    <a:stretch>
+                      <a:fillRect/>
+                    </a:stretch>
+                  </pic:blipFill>
+                  <pic:spPr bwMode="auto">
+                    <a:xfrm>
+                      <a:off x="0" y="0"/>
+                      <a:ext cx="5795010" cy="5468620"/>
+                    </a:xfrm>
+                    <a:prstGeom prst="rect">
+                      <a:avLst/>
+                    </a:prstGeom>
+                    <a:noFill/>
+                    <a:ln>
+                      <a:noFill/>
+                    </a:ln>
+                  </pic:spPr>
+                </pic:pic>
+              </a:graphicData>
+            </a:graphic>
+          </wp:inline>
+        </w:drawing>
       </w:r>
       <w:r>
         <w:pict w14:anchorId="397300B6">
-          <v:group id="Group 13652" o:spid="_x0000_s1128" style="width:458.5pt;height:370.3pt;mso-position-horizontal-relative:char;mso-position-vertical-relative:line" coordsize="58230,47026" o:gfxdata="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">
+          <v:group id="Group 13652" o:spid="_x0000_s1128" style="width:458.5pt;height:370.3pt;mso-position-horizontal-relative:char;mso-position-vertical-relative:line" coordsize="58230,47026">
             <v:shapetype id="_x0000_t202" coordsize="21600,21600" o:spt="202" path="m,l,21600r21600,l21600,xe">
               <v:stroke joinstyle="miter"/>
               <v:path gradientshapeok="t" o:connecttype="rect"/>
             </v:shapetype>
             <v:shape id="Cuadro de texto 1273801431" o:spid="_x0000_s1129" type="#_x0000_t202" style="position:absolute;width:417;height:1411;visibility:visible;mso-wrap-style:square;v-text-anchor:top" o:gfxdata="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" filled="f" stroked="f" strokeweight="0">
-              <v:textbox inset="0,0,0,0">
+              <v:textbox style="mso-next-textbox:#Cuadro de texto 1273801431" inset="0,0,0,0">
                 <w:txbxContent>
                   <w:p>
                     <w:pPr>
@@ -2331,7 +2978,7 @@
               </v:textbox>
             </v:shape>
             <v:shape id="Cuadro de texto 1923110307" o:spid="_x0000_s1130" type="#_x0000_t202" style="position:absolute;left:57808;top:45619;width:418;height:1411;visibility:visible;mso-wrap-style:square;v-text-anchor:top" o:gfxdata="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" filled="f" stroked="f" strokeweight="0">
-              <v:textbox inset="0,0,0,0">
+              <v:textbox style="mso-next-textbox:#Cuadro de texto 1923110307" inset="0,0,0,0">
                 <w:txbxContent>
                   <w:p>
                     <w:pPr>
@@ -2369,7 +3016,7 @@
               <o:lock v:ext="edit" aspectratio="t"/>
             </v:shapetype>
             <v:shape id="Picture 2038" o:spid="_x0000_s1131" type="#_x0000_t75" style="position:absolute;left:284;top:2005;width:57233;height:44334;visibility:visible;mso-wrap-style:square" o:gfxdata="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" strokeweight="0">
-              <v:imagedata r:id="rId12" o:title=""/>
+              <v:imagedata r:id="rId13" o:title=""/>
             </v:shape>
             <v:line id="Conector recto 1843637945" o:spid="_x0000_s1132" style="position:absolute;visibility:visible;mso-wrap-style:square" from="190,2005" to="57571,2005" o:connectortype="straight" o:gfxdata="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" strokeweight="0"/>
             <v:line id="Conector recto 331130672" o:spid="_x0000_s1133" style="position:absolute;visibility:visible;mso-wrap-style:square" from="57574,1954" to="57574,46436" o:connectortype="straight" o:gfxdata="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" strokeweight="0"/>
@@ -2379,41 +3026,663 @@
           </v:group>
         </w:pict>
       </w:r>
-    </w:p>
-    <w:p>
-      <w:pPr>
-        <w:spacing w:after="83" w:line="240" w:lineRule="auto"/>
-        <w:ind w:left="-5" w:hanging="10"/>
-        <w:rPr>
-          <w:rFonts w:ascii="Arial" w:hAnsi="Arial"/>
-        </w:rPr>
-      </w:pPr>
-      <w:r>
-        <w:rPr>
-          <w:rFonts w:ascii="Arial" w:eastAsia="Arial" w:hAnsi="Arial" w:cs="Arial"/>
-          <w:sz w:val="18"/>
-        </w:rPr>
-        <w:t xml:space="preserve">Ofrece opciones de alojamiento: </w:t>
-      </w:r>
-    </w:p>
-    <w:p>
-      <w:pPr>
-        <w:spacing w:after="0" w:line="240" w:lineRule="auto"/>
-        <w:ind w:right="-30"/>
-        <w:rPr>
-          <w:rFonts w:ascii="Arial" w:hAnsi="Arial"/>
-        </w:rPr>
-      </w:pPr>
-      <w:r>
-        <w:rPr>
-          <w:noProof/>
-        </w:rPr>
+      <w:r>
+        <w:t xml:space="preserve"> </w:t>
+      </w:r>
+      <w:r>
+        <w:t xml:space="preserve">Se </w:t>
+      </w:r>
+      <w:proofErr w:type="gramStart"/>
+      <w:r>
+        <w:t>identificaron  diferentes</w:t>
+      </w:r>
+      <w:proofErr w:type="gramEnd"/>
+      <w:r>
+        <w:t xml:space="preserve"> modalidades de alojamiento disponibles para l</w:t>
+      </w:r>
+      <w:r>
+        <w:t>os participantes</w:t>
+      </w:r>
+      <w:r>
+        <w:t>.</w:t>
+      </w:r>
+      <w:r>
+        <w:t xml:space="preserve"> </w:t>
+      </w:r>
+      <w:r>
+        <w:pict w14:anchorId="051A8845">
+          <v:group id="Group 14120" o:spid="_x0000_s1137" style="width:456.1pt;height:422.55pt;mso-position-horizontal-relative:char;mso-position-vertical-relative:line" coordsize="58230,53665">
+            <v:shape id="Cuadro de texto 1021373637" o:spid="_x0000_s1138" type="#_x0000_t202" style="position:absolute;left:57808;top:30024;width:418;height:1414;visibility:visible;mso-wrap-style:square;v-text-anchor:top" o:gfxdata="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" filled="f" stroked="f" strokeweight="0">
+              <v:textbox style="mso-next-textbox:#Cuadro de texto 1021373637" inset="0,0,0,0">
+                <w:txbxContent>
+                  <w:p>
+                    <w:pPr>
+                      <w:overflowPunct w:val="0"/>
+                      <w:spacing w:after="0" w:line="240" w:lineRule="auto"/>
+                    </w:pPr>
+                    <w:r>
+                      <w:rPr>
+                        <w:rFonts w:asciiTheme="minorHAnsi" w:eastAsiaTheme="minorEastAsia" w:hAnsiTheme="minorHAnsi" w:cstheme="minorBidi"/>
+                        <w:sz w:val="18"/>
+                      </w:rPr>
+                      <w:t xml:space="preserve"> </w:t>
+                    </w:r>
+                  </w:p>
+                </w:txbxContent>
+              </v:textbox>
+            </v:shape>
+            <v:shape id="Cuadro de texto 1972133098" o:spid="_x0000_s1139" type="#_x0000_t202" style="position:absolute;top:31978;width:4806;height:1415;visibility:visible;mso-wrap-style:square;v-text-anchor:top" o:gfxdata="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" filled="f" stroked="f" strokeweight="0">
+              <v:textbox style="mso-next-textbox:#Cuadro de texto 1972133098" inset="0,0,0,0">
+                <w:txbxContent>
+                  <w:p>
+                    <w:pPr>
+                      <w:overflowPunct w:val="0"/>
+                      <w:spacing w:after="0" w:line="240" w:lineRule="auto"/>
+                    </w:pPr>
+                    <w:r>
+                      <w:rPr>
+                        <w:rFonts w:asciiTheme="minorHAnsi" w:eastAsiaTheme="minorEastAsia" w:hAnsiTheme="minorHAnsi" w:cstheme="minorBidi"/>
+                        <w:sz w:val="18"/>
+                      </w:rPr>
+                      <w:t>Incluye</w:t>
+                    </w:r>
+                  </w:p>
+                </w:txbxContent>
+              </v:textbox>
+            </v:shape>
+            <v:shape id="Cuadro de texto 2134245649" o:spid="_x0000_s1140" type="#_x0000_t202" style="position:absolute;left:3614;top:31978;width:418;height:1415;visibility:visible;mso-wrap-style:square;v-text-anchor:top" o:gfxdata="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" filled="f" stroked="f" strokeweight="0">
+              <v:textbox style="mso-next-textbox:#Cuadro de texto 2134245649" inset="0,0,0,0">
+                <w:txbxContent>
+                  <w:p>
+                    <w:pPr>
+                      <w:overflowPunct w:val="0"/>
+                      <w:spacing w:after="0" w:line="240" w:lineRule="auto"/>
+                    </w:pPr>
+                    <w:r>
+                      <w:rPr>
+                        <w:rFonts w:asciiTheme="minorHAnsi" w:eastAsiaTheme="minorEastAsia" w:hAnsiTheme="minorHAnsi" w:cstheme="minorBidi"/>
+                        <w:sz w:val="18"/>
+                      </w:rPr>
+                      <w:t xml:space="preserve"> </w:t>
+                    </w:r>
+                  </w:p>
+                </w:txbxContent>
+              </v:textbox>
+            </v:shape>
+            <v:shape id="Cuadro de texto 609819071" o:spid="_x0000_s1141" type="#_x0000_t202" style="position:absolute;left:3931;top:31978;width:1677;height:1415;visibility:visible;mso-wrap-style:square;v-text-anchor:top" o:gfxdata="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" filled="f" stroked="f" strokeweight="0">
+              <v:textbox style="mso-next-textbox:#Cuadro de texto 609819071" inset="0,0,0,0">
+                <w:txbxContent>
+                  <w:p>
+                    <w:pPr>
+                      <w:overflowPunct w:val="0"/>
+                      <w:spacing w:after="0" w:line="240" w:lineRule="auto"/>
+                    </w:pPr>
+                    <w:r>
+                      <w:rPr>
+                        <w:rFonts w:asciiTheme="minorHAnsi" w:eastAsiaTheme="minorEastAsia" w:hAnsiTheme="minorHAnsi" w:cstheme="minorBidi"/>
+                        <w:sz w:val="18"/>
+                      </w:rPr>
+                      <w:t>un</w:t>
+                    </w:r>
+                  </w:p>
+                </w:txbxContent>
+              </v:textbox>
+            </v:shape>
+            <v:shape id="Cuadro de texto 1581744463" o:spid="_x0000_s1142" type="#_x0000_t202" style="position:absolute;left:5205;top:31978;width:414;height:1415;visibility:visible;mso-wrap-style:square;v-text-anchor:top" o:gfxdata="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" filled="f" stroked="f" strokeweight="0">
+              <v:textbox style="mso-next-textbox:#Cuadro de texto 1581744463" inset="0,0,0,0">
+                <w:txbxContent>
+                  <w:p>
+                    <w:pPr>
+                      <w:overflowPunct w:val="0"/>
+                      <w:spacing w:after="0" w:line="240" w:lineRule="auto"/>
+                    </w:pPr>
+                    <w:r>
+                      <w:rPr>
+                        <w:rFonts w:asciiTheme="minorHAnsi" w:eastAsiaTheme="minorEastAsia" w:hAnsiTheme="minorHAnsi" w:cstheme="minorBidi"/>
+                        <w:sz w:val="18"/>
+                      </w:rPr>
+                      <w:t xml:space="preserve"> </w:t>
+                    </w:r>
+                  </w:p>
+                </w:txbxContent>
+              </v:textbox>
+            </v:shape>
+            <v:shape id="Cuadro de texto 1352346082" o:spid="_x0000_s1143" type="#_x0000_t202" style="position:absolute;left:5518;top:31978;width:4382;height:1415;visibility:visible;mso-wrap-style:square;v-text-anchor:top" o:gfxdata="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" filled="f" stroked="f" strokeweight="0">
+              <v:textbox style="mso-next-textbox:#Cuadro de texto 1352346082" inset="0,0,0,0">
+                <w:txbxContent>
+                  <w:p>
+                    <w:pPr>
+                      <w:overflowPunct w:val="0"/>
+                      <w:spacing w:after="0" w:line="240" w:lineRule="auto"/>
+                    </w:pPr>
+                    <w:r>
+                      <w:rPr>
+                        <w:rFonts w:asciiTheme="minorHAnsi" w:eastAsiaTheme="minorEastAsia" w:hAnsiTheme="minorHAnsi" w:cstheme="minorBidi"/>
+                        <w:sz w:val="18"/>
+                      </w:rPr>
+                      <w:t>listado</w:t>
+                    </w:r>
+                  </w:p>
+                </w:txbxContent>
+              </v:textbox>
+            </v:shape>
+            <v:shape id="Cuadro de texto 65551851" o:spid="_x0000_s1144" type="#_x0000_t202" style="position:absolute;left:8820;top:31978;width:414;height:1415;visibility:visible;mso-wrap-style:square;v-text-anchor:top" o:gfxdata="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" filled="f" stroked="f" strokeweight="0">
+              <v:textbox style="mso-next-textbox:#Cuadro de texto 65551851" inset="0,0,0,0">
+                <w:txbxContent>
+                  <w:p>
+                    <w:pPr>
+                      <w:overflowPunct w:val="0"/>
+                      <w:spacing w:after="0" w:line="240" w:lineRule="auto"/>
+                    </w:pPr>
+                    <w:r>
+                      <w:rPr>
+                        <w:rFonts w:asciiTheme="minorHAnsi" w:eastAsiaTheme="minorEastAsia" w:hAnsiTheme="minorHAnsi" w:cstheme="minorBidi"/>
+                        <w:sz w:val="18"/>
+                      </w:rPr>
+                      <w:t xml:space="preserve"> </w:t>
+                    </w:r>
+                  </w:p>
+                </w:txbxContent>
+              </v:textbox>
+            </v:shape>
+            <v:shape id="Cuadro de texto 570741714" o:spid="_x0000_s1145" type="#_x0000_t202" style="position:absolute;left:9129;top:31978;width:1681;height:1415;visibility:visible;mso-wrap-style:square;v-text-anchor:top" o:gfxdata="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" filled="f" stroked="f" strokeweight="0">
+              <v:textbox style="mso-next-textbox:#Cuadro de texto 570741714" inset="0,0,0,0">
+                <w:txbxContent>
+                  <w:p>
+                    <w:pPr>
+                      <w:overflowPunct w:val="0"/>
+                      <w:spacing w:after="0" w:line="240" w:lineRule="auto"/>
+                    </w:pPr>
+                    <w:r>
+                      <w:rPr>
+                        <w:rFonts w:asciiTheme="minorHAnsi" w:eastAsiaTheme="minorEastAsia" w:hAnsiTheme="minorHAnsi" w:cstheme="minorBidi"/>
+                        <w:sz w:val="18"/>
+                      </w:rPr>
+                      <w:t>de</w:t>
+                    </w:r>
+                  </w:p>
+                </w:txbxContent>
+              </v:textbox>
+            </v:shape>
+            <v:shape id="Cuadro de texto 445188604" o:spid="_x0000_s1146" type="#_x0000_t202" style="position:absolute;left:10400;top:31978;width:418;height:1415;visibility:visible;mso-wrap-style:square;v-text-anchor:top" o:gfxdata="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" filled="f" stroked="f" strokeweight="0">
+              <v:textbox style="mso-next-textbox:#Cuadro de texto 445188604" inset="0,0,0,0">
+                <w:txbxContent>
+                  <w:p>
+                    <w:pPr>
+                      <w:overflowPunct w:val="0"/>
+                      <w:spacing w:after="0" w:line="240" w:lineRule="auto"/>
+                    </w:pPr>
+                    <w:r>
+                      <w:rPr>
+                        <w:rFonts w:asciiTheme="minorHAnsi" w:eastAsiaTheme="minorEastAsia" w:hAnsiTheme="minorHAnsi" w:cstheme="minorBidi"/>
+                        <w:sz w:val="18"/>
+                      </w:rPr>
+                      <w:t xml:space="preserve"> </w:t>
+                    </w:r>
+                  </w:p>
+                </w:txbxContent>
+              </v:textbox>
+            </v:shape>
+            <v:shape id="Cuadro de texto 1095704472" o:spid="_x0000_s1147" type="#_x0000_t202" style="position:absolute;left:10717;top:31978;width:7589;height:1415;visibility:visible;mso-wrap-style:square;v-text-anchor:top" o:gfxdata="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" filled="f" stroked="f" strokeweight="0">
+              <v:textbox style="mso-next-textbox:#Cuadro de texto 1095704472" inset="0,0,0,0">
+                <w:txbxContent>
+                  <w:p>
+                    <w:pPr>
+                      <w:overflowPunct w:val="0"/>
+                      <w:spacing w:after="0" w:line="240" w:lineRule="auto"/>
+                    </w:pPr>
+                    <w:r>
+                      <w:rPr>
+                        <w:rFonts w:asciiTheme="minorHAnsi" w:eastAsiaTheme="minorEastAsia" w:hAnsiTheme="minorHAnsi" w:cstheme="minorBidi"/>
+                        <w:sz w:val="18"/>
+                      </w:rPr>
+                      <w:t>actividades</w:t>
+                    </w:r>
+                  </w:p>
+                </w:txbxContent>
+              </v:textbox>
+            </v:shape>
+            <v:shape id="Cuadro de texto 878059799" o:spid="_x0000_s1148" type="#_x0000_t202" style="position:absolute;left:16426;top:31978;width:418;height:1415;visibility:visible;mso-wrap-style:square;v-text-anchor:top" o:gfxdata="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" filled="f" stroked="f" strokeweight="0">
+              <v:textbox style="mso-next-textbox:#Cuadro de texto 878059799" inset="0,0,0,0">
+                <w:txbxContent>
+                  <w:p>
+                    <w:pPr>
+                      <w:overflowPunct w:val="0"/>
+                      <w:spacing w:after="0" w:line="240" w:lineRule="auto"/>
+                    </w:pPr>
+                    <w:r>
+                      <w:rPr>
+                        <w:rFonts w:asciiTheme="minorHAnsi" w:eastAsiaTheme="minorEastAsia" w:hAnsiTheme="minorHAnsi" w:cstheme="minorBidi"/>
+                        <w:sz w:val="18"/>
+                      </w:rPr>
+                      <w:t xml:space="preserve"> </w:t>
+                    </w:r>
+                  </w:p>
+                </w:txbxContent>
+              </v:textbox>
+            </v:shape>
+            <v:shape id="Cuadro de texto 104237298" o:spid="_x0000_s1149" type="#_x0000_t202" style="position:absolute;left:16743;top:31978;width:5479;height:1415;visibility:visible;mso-wrap-style:square;v-text-anchor:top" o:gfxdata="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" filled="f" stroked="f" strokeweight="0">
+              <v:textbox style="mso-next-textbox:#Cuadro de texto 104237298" inset="0,0,0,0">
+                <w:txbxContent>
+                  <w:p>
+                    <w:pPr>
+                      <w:overflowPunct w:val="0"/>
+                      <w:spacing w:after="0" w:line="240" w:lineRule="auto"/>
+                    </w:pPr>
+                    <w:r>
+                      <w:rPr>
+                        <w:rFonts w:asciiTheme="minorHAnsi" w:eastAsiaTheme="minorEastAsia" w:hAnsiTheme="minorHAnsi" w:cstheme="minorBidi"/>
+                        <w:sz w:val="18"/>
+                      </w:rPr>
+                      <w:t>general:</w:t>
+                    </w:r>
+                  </w:p>
+                </w:txbxContent>
+              </v:textbox>
+            </v:shape>
+            <v:shape id="Cuadro de texto 905599247" o:spid="_x0000_s1150" type="#_x0000_t202" style="position:absolute;left:20865;top:31978;width:418;height:1415;visibility:visible;mso-wrap-style:square;v-text-anchor:top" o:gfxdata="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" filled="f" stroked="f" strokeweight="0">
+              <v:textbox style="mso-next-textbox:#Cuadro de texto 905599247" inset="0,0,0,0">
+                <w:txbxContent>
+                  <w:p>
+                    <w:pPr>
+                      <w:overflowPunct w:val="0"/>
+                      <w:spacing w:after="0" w:line="240" w:lineRule="auto"/>
+                    </w:pPr>
+                    <w:r>
+                      <w:rPr>
+                        <w:rFonts w:asciiTheme="minorHAnsi" w:eastAsiaTheme="minorEastAsia" w:hAnsiTheme="minorHAnsi" w:cstheme="minorBidi"/>
+                        <w:sz w:val="18"/>
+                      </w:rPr>
+                      <w:t xml:space="preserve"> </w:t>
+                    </w:r>
+                  </w:p>
+                </w:txbxContent>
+              </v:textbox>
+            </v:shape>
+            <v:shape id="Cuadro de texto 1452048959" o:spid="_x0000_s1151" type="#_x0000_t202" style="position:absolute;left:44121;top:50284;width:418;height:1415;visibility:visible;mso-wrap-style:square;v-text-anchor:top" o:gfxdata="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" filled="f" stroked="f" strokeweight="0">
+              <v:textbox style="mso-next-textbox:#Cuadro de texto 1452048959" inset="0,0,0,0">
+                <w:txbxContent>
+                  <w:p>
+                    <w:pPr>
+                      <w:overflowPunct w:val="0"/>
+                      <w:spacing w:after="0" w:line="240" w:lineRule="auto"/>
+                    </w:pPr>
+                    <w:r>
+                      <w:rPr>
+                        <w:rFonts w:asciiTheme="minorHAnsi" w:eastAsiaTheme="minorEastAsia" w:hAnsiTheme="minorHAnsi" w:cstheme="minorBidi"/>
+                        <w:sz w:val="18"/>
+                      </w:rPr>
+                      <w:t xml:space="preserve"> </w:t>
+                    </w:r>
+                  </w:p>
+                </w:txbxContent>
+              </v:textbox>
+            </v:shape>
+            <v:shape id="Cuadro de texto 321525396" o:spid="_x0000_s1152" type="#_x0000_t202" style="position:absolute;top:52246;width:6573;height:1415;visibility:visible;mso-wrap-style:square;v-text-anchor:top" o:gfxdata="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" filled="f" stroked="f" strokeweight="0">
+              <v:textbox style="mso-next-textbox:#Cuadro de texto 321525396" inset="0,0,0,0">
+                <w:txbxContent>
+                  <w:p>
+                    <w:pPr>
+                      <w:overflowPunct w:val="0"/>
+                      <w:spacing w:after="0" w:line="240" w:lineRule="auto"/>
+                    </w:pPr>
+                    <w:r>
+                      <w:rPr>
+                        <w:rFonts w:asciiTheme="minorHAnsi" w:eastAsiaTheme="minorEastAsia" w:hAnsiTheme="minorHAnsi" w:cstheme="minorBidi"/>
+                        <w:sz w:val="18"/>
+                      </w:rPr>
+                      <w:t>Menciona</w:t>
+                    </w:r>
+                  </w:p>
+                </w:txbxContent>
+              </v:textbox>
+            </v:shape>
+            <v:shape id="Cuadro de texto 1519058171" o:spid="_x0000_s1153" type="#_x0000_t202" style="position:absolute;left:4946;top:52246;width:418;height:1415;visibility:visible;mso-wrap-style:square;v-text-anchor:top" o:gfxdata="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" filled="f" stroked="f" strokeweight="0">
+              <v:textbox style="mso-next-textbox:#Cuadro de texto 1519058171" inset="0,0,0,0">
+                <w:txbxContent>
+                  <w:p>
+                    <w:pPr>
+                      <w:overflowPunct w:val="0"/>
+                      <w:spacing w:after="0" w:line="240" w:lineRule="auto"/>
+                    </w:pPr>
+                    <w:r>
+                      <w:rPr>
+                        <w:rFonts w:asciiTheme="minorHAnsi" w:eastAsiaTheme="minorEastAsia" w:hAnsiTheme="minorHAnsi" w:cstheme="minorBidi"/>
+                        <w:sz w:val="18"/>
+                      </w:rPr>
+                      <w:t xml:space="preserve"> </w:t>
+                    </w:r>
+                  </w:p>
+                </w:txbxContent>
+              </v:textbox>
+            </v:shape>
+            <v:shape id="Cuadro de texto 1163804786" o:spid="_x0000_s1154" type="#_x0000_t202" style="position:absolute;left:5263;top:52246;width:831;height:1415;visibility:visible;mso-wrap-style:square;v-text-anchor:top" o:gfxdata="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" filled="f" stroked="f" strokeweight="0">
+              <v:textbox style="mso-next-textbox:#Cuadro de texto 1163804786" inset="0,0,0,0">
+                <w:txbxContent>
+                  <w:p>
+                    <w:pPr>
+                      <w:overflowPunct w:val="0"/>
+                      <w:spacing w:after="0" w:line="240" w:lineRule="auto"/>
+                    </w:pPr>
+                    <w:r>
+                      <w:rPr>
+                        <w:rFonts w:asciiTheme="minorHAnsi" w:eastAsiaTheme="minorEastAsia" w:hAnsiTheme="minorHAnsi" w:cstheme="minorBidi"/>
+                        <w:sz w:val="18"/>
+                      </w:rPr>
+                      <w:t>a</w:t>
+                    </w:r>
+                  </w:p>
+                </w:txbxContent>
+              </v:textbox>
+            </v:shape>
+            <v:shape id="Cuadro de texto 822741168" o:spid="_x0000_s1155" type="#_x0000_t202" style="position:absolute;left:5900;top:52246;width:418;height:1415;visibility:visible;mso-wrap-style:square;v-text-anchor:top" o:gfxdata="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" filled="f" stroked="f" strokeweight="0">
+              <v:textbox style="mso-next-textbox:#Cuadro de texto 822741168" inset="0,0,0,0">
+                <w:txbxContent>
+                  <w:p>
+                    <w:pPr>
+                      <w:overflowPunct w:val="0"/>
+                      <w:spacing w:after="0" w:line="240" w:lineRule="auto"/>
+                    </w:pPr>
+                    <w:r>
+                      <w:rPr>
+                        <w:rFonts w:asciiTheme="minorHAnsi" w:eastAsiaTheme="minorEastAsia" w:hAnsiTheme="minorHAnsi" w:cstheme="minorBidi"/>
+                        <w:sz w:val="18"/>
+                      </w:rPr>
+                      <w:t xml:space="preserve"> </w:t>
+                    </w:r>
+                  </w:p>
+                </w:txbxContent>
+              </v:textbox>
+            </v:shape>
+            <v:shape id="Cuadro de texto 316324874" o:spid="_x0000_s1156" type="#_x0000_t202" style="position:absolute;left:6217;top:52246;width:1937;height:1415;visibility:visible;mso-wrap-style:square;v-text-anchor:top" o:gfxdata="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" filled="f" stroked="f" strokeweight="0">
+              <v:textbox style="mso-next-textbox:#Cuadro de texto 316324874" inset="0,0,0,0">
+                <w:txbxContent>
+                  <w:p>
+                    <w:pPr>
+                      <w:overflowPunct w:val="0"/>
+                      <w:spacing w:after="0" w:line="240" w:lineRule="auto"/>
+                    </w:pPr>
+                    <w:r>
+                      <w:rPr>
+                        <w:rFonts w:asciiTheme="minorHAnsi" w:eastAsiaTheme="minorEastAsia" w:hAnsiTheme="minorHAnsi" w:cstheme="minorBidi"/>
+                        <w:sz w:val="18"/>
+                      </w:rPr>
+                      <w:t>los</w:t>
+                    </w:r>
+                  </w:p>
+                </w:txbxContent>
+              </v:textbox>
+            </v:shape>
+            <v:shape id="Cuadro de texto 684096198" o:spid="_x0000_s1157" type="#_x0000_t202" style="position:absolute;left:7678;top:52246;width:418;height:1415;visibility:visible;mso-wrap-style:square;v-text-anchor:top" o:gfxdata="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" filled="f" stroked="f" strokeweight="0">
+              <v:textbox style="mso-next-textbox:#Cuadro de texto 684096198" inset="0,0,0,0">
+                <w:txbxContent>
+                  <w:p>
+                    <w:pPr>
+                      <w:overflowPunct w:val="0"/>
+                      <w:spacing w:after="0" w:line="240" w:lineRule="auto"/>
+                    </w:pPr>
+                    <w:r>
+                      <w:rPr>
+                        <w:rFonts w:asciiTheme="minorHAnsi" w:eastAsiaTheme="minorEastAsia" w:hAnsiTheme="minorHAnsi" w:cstheme="minorBidi"/>
+                        <w:sz w:val="18"/>
+                      </w:rPr>
+                      <w:t xml:space="preserve"> </w:t>
+                    </w:r>
+                  </w:p>
+                </w:txbxContent>
+              </v:textbox>
+            </v:shape>
+            <v:shape id="Cuadro de texto 1988477773" o:spid="_x0000_s1158" type="#_x0000_t202" style="position:absolute;left:7995;top:52246;width:4637;height:1415;visibility:visible;mso-wrap-style:square;v-text-anchor:top" o:gfxdata="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" filled="f" stroked="f" strokeweight="0">
+              <v:textbox style="mso-next-textbox:#Cuadro de texto 1988477773" inset="0,0,0,0">
+                <w:txbxContent>
+                  <w:p>
+                    <w:pPr>
+                      <w:overflowPunct w:val="0"/>
+                      <w:spacing w:after="0" w:line="240" w:lineRule="auto"/>
+                    </w:pPr>
+                    <w:r>
+                      <w:rPr>
+                        <w:rFonts w:asciiTheme="minorHAnsi" w:eastAsiaTheme="minorEastAsia" w:hAnsiTheme="minorHAnsi" w:cstheme="minorBidi"/>
+                        <w:sz w:val="18"/>
+                      </w:rPr>
+                      <w:t>tutores</w:t>
+                    </w:r>
+                  </w:p>
+                </w:txbxContent>
+              </v:textbox>
+            </v:shape>
+            <v:shape id="Cuadro de texto 1195909562" o:spid="_x0000_s1159" type="#_x0000_t202" style="position:absolute;left:11480;top:52246;width:418;height:1415;visibility:visible;mso-wrap-style:square;v-text-anchor:top" o:gfxdata="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" filled="f" stroked="f" strokeweight="0">
+              <v:textbox style="mso-next-textbox:#Cuadro de texto 1195909562" inset="0,0,0,0">
+                <w:txbxContent>
+                  <w:p>
+                    <w:pPr>
+                      <w:overflowPunct w:val="0"/>
+                      <w:spacing w:after="0" w:line="240" w:lineRule="auto"/>
+                    </w:pPr>
+                    <w:r>
+                      <w:rPr>
+                        <w:rFonts w:asciiTheme="minorHAnsi" w:eastAsiaTheme="minorEastAsia" w:hAnsiTheme="minorHAnsi" w:cstheme="minorBidi"/>
+                        <w:sz w:val="18"/>
+                      </w:rPr>
+                      <w:t xml:space="preserve"> </w:t>
+                    </w:r>
+                  </w:p>
+                </w:txbxContent>
+              </v:textbox>
+            </v:shape>
+            <v:shape id="Cuadro de texto 1066020643" o:spid="_x0000_s1160" type="#_x0000_t202" style="position:absolute;left:11797;top:52246;width:7923;height:1415;visibility:visible;mso-wrap-style:square;v-text-anchor:top" o:gfxdata="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" filled="f" stroked="f" strokeweight="0">
+              <v:textbox style="mso-next-textbox:#Cuadro de texto 1066020643" inset="0,0,0,0">
+                <w:txbxContent>
+                  <w:p>
+                    <w:pPr>
+                      <w:overflowPunct w:val="0"/>
+                      <w:spacing w:after="0" w:line="240" w:lineRule="auto"/>
+                    </w:pPr>
+                    <w:r>
+                      <w:rPr>
+                        <w:rFonts w:asciiTheme="minorHAnsi" w:eastAsiaTheme="minorEastAsia" w:hAnsiTheme="minorHAnsi" w:cstheme="minorBidi"/>
+                        <w:sz w:val="18"/>
+                      </w:rPr>
+                      <w:t>encargados</w:t>
+                    </w:r>
+                  </w:p>
+                </w:txbxContent>
+              </v:textbox>
+            </v:shape>
+            <v:shape id="Cuadro de texto 664146888" o:spid="_x0000_s1161" type="#_x0000_t202" style="position:absolute;left:17762;top:52246;width:418;height:1415;visibility:visible;mso-wrap-style:square;v-text-anchor:top" o:gfxdata="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" filled="f" stroked="f" strokeweight="0">
+              <v:textbox style="mso-next-textbox:#Cuadro de texto 664146888" inset="0,0,0,0">
+                <w:txbxContent>
+                  <w:p>
+                    <w:pPr>
+                      <w:overflowPunct w:val="0"/>
+                      <w:spacing w:after="0" w:line="240" w:lineRule="auto"/>
+                    </w:pPr>
+                    <w:r>
+                      <w:rPr>
+                        <w:rFonts w:asciiTheme="minorHAnsi" w:eastAsiaTheme="minorEastAsia" w:hAnsiTheme="minorHAnsi" w:cstheme="minorBidi"/>
+                        <w:sz w:val="18"/>
+                      </w:rPr>
+                      <w:t xml:space="preserve"> </w:t>
+                    </w:r>
+                  </w:p>
+                </w:txbxContent>
+              </v:textbox>
+            </v:shape>
+            <v:shape id="Cuadro de texto 862339742" o:spid="_x0000_s1162" type="#_x0000_t202" style="position:absolute;left:18079;top:52246;width:1681;height:1415;visibility:visible;mso-wrap-style:square;v-text-anchor:top" o:gfxdata="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" filled="f" stroked="f" strokeweight="0">
+              <v:textbox style="mso-next-textbox:#Cuadro de texto 862339742" inset="0,0,0,0">
+                <w:txbxContent>
+                  <w:p>
+                    <w:pPr>
+                      <w:overflowPunct w:val="0"/>
+                      <w:spacing w:after="0" w:line="240" w:lineRule="auto"/>
+                    </w:pPr>
+                    <w:r>
+                      <w:rPr>
+                        <w:rFonts w:asciiTheme="minorHAnsi" w:eastAsiaTheme="minorEastAsia" w:hAnsiTheme="minorHAnsi" w:cstheme="minorBidi"/>
+                        <w:sz w:val="18"/>
+                      </w:rPr>
+                      <w:t>de</w:t>
+                    </w:r>
+                  </w:p>
+                </w:txbxContent>
+              </v:textbox>
+            </v:shape>
+            <v:shape id="Cuadro de texto 758058197" o:spid="_x0000_s1163" type="#_x0000_t202" style="position:absolute;left:19350;top:52246;width:417;height:1415;visibility:visible;mso-wrap-style:square;v-text-anchor:top" o:gfxdata="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" filled="f" stroked="f" strokeweight="0">
+              <v:textbox style="mso-next-textbox:#Cuadro de texto 758058197" inset="0,0,0,0">
+                <w:txbxContent>
+                  <w:p>
+                    <w:pPr>
+                      <w:overflowPunct w:val="0"/>
+                      <w:spacing w:after="0" w:line="240" w:lineRule="auto"/>
+                    </w:pPr>
+                    <w:r>
+                      <w:rPr>
+                        <w:rFonts w:asciiTheme="minorHAnsi" w:eastAsiaTheme="minorEastAsia" w:hAnsiTheme="minorHAnsi" w:cstheme="minorBidi"/>
+                        <w:sz w:val="18"/>
+                      </w:rPr>
+                      <w:t xml:space="preserve"> </w:t>
+                    </w:r>
+                  </w:p>
+                </w:txbxContent>
+              </v:textbox>
+            </v:shape>
+            <v:shape id="Cuadro de texto 1048172622" o:spid="_x0000_s1164" type="#_x0000_t202" style="position:absolute;left:19666;top:52246;width:3366;height:1415;visibility:visible;mso-wrap-style:square;v-text-anchor:top" o:gfxdata="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" filled="f" stroked="f" strokeweight="0">
+              <v:textbox style="mso-next-textbox:#Cuadro de texto 1048172622" inset="0,0,0,0">
+                <w:txbxContent>
+                  <w:p>
+                    <w:pPr>
+                      <w:overflowPunct w:val="0"/>
+                      <w:spacing w:after="0" w:line="240" w:lineRule="auto"/>
+                    </w:pPr>
+                    <w:r>
+                      <w:rPr>
+                        <w:rFonts w:asciiTheme="minorHAnsi" w:eastAsiaTheme="minorEastAsia" w:hAnsiTheme="minorHAnsi" w:cstheme="minorBidi"/>
+                        <w:sz w:val="18"/>
+                      </w:rPr>
+                      <w:t>guiar</w:t>
+                    </w:r>
+                  </w:p>
+                </w:txbxContent>
+              </v:textbox>
+            </v:shape>
+            <v:shape id="Cuadro de texto 294066993" o:spid="_x0000_s1165" type="#_x0000_t202" style="position:absolute;left:22201;top:52246;width:417;height:1415;visibility:visible;mso-wrap-style:square;v-text-anchor:top" o:gfxdata="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" filled="f" stroked="f" strokeweight="0">
+              <v:textbox style="mso-next-textbox:#Cuadro de texto 294066993" inset="0,0,0,0">
+                <w:txbxContent>
+                  <w:p>
+                    <w:pPr>
+                      <w:overflowPunct w:val="0"/>
+                      <w:spacing w:after="0" w:line="240" w:lineRule="auto"/>
+                    </w:pPr>
+                    <w:r>
+                      <w:rPr>
+                        <w:rFonts w:asciiTheme="minorHAnsi" w:eastAsiaTheme="minorEastAsia" w:hAnsiTheme="minorHAnsi" w:cstheme="minorBidi"/>
+                        <w:sz w:val="18"/>
+                      </w:rPr>
+                      <w:t xml:space="preserve"> </w:t>
+                    </w:r>
+                  </w:p>
+                </w:txbxContent>
+              </v:textbox>
+            </v:shape>
+            <v:shape id="Cuadro de texto 383925049" o:spid="_x0000_s1166" type="#_x0000_t202" style="position:absolute;left:22518;top:52246;width:1170;height:1415;visibility:visible;mso-wrap-style:square;v-text-anchor:top" o:gfxdata="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" filled="f" stroked="f" strokeweight="0">
+              <v:textbox style="mso-next-textbox:#Cuadro de texto 383925049" inset="0,0,0,0">
+                <w:txbxContent>
+                  <w:p>
+                    <w:pPr>
+                      <w:overflowPunct w:val="0"/>
+                      <w:spacing w:after="0" w:line="240" w:lineRule="auto"/>
+                    </w:pPr>
+                    <w:r>
+                      <w:rPr>
+                        <w:rFonts w:asciiTheme="minorHAnsi" w:eastAsiaTheme="minorEastAsia" w:hAnsiTheme="minorHAnsi" w:cstheme="minorBidi"/>
+                        <w:sz w:val="18"/>
+                      </w:rPr>
+                      <w:t>el</w:t>
+                    </w:r>
+                  </w:p>
+                </w:txbxContent>
+              </v:textbox>
+            </v:shape>
+            <v:shape id="Cuadro de texto 707916133" o:spid="_x0000_s1167" type="#_x0000_t202" style="position:absolute;left:23407;top:52246;width:414;height:1415;visibility:visible;mso-wrap-style:square;v-text-anchor:top" o:gfxdata="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" filled="f" stroked="f" strokeweight="0">
+              <v:textbox style="mso-next-textbox:#Cuadro de texto 707916133" inset="0,0,0,0">
+                <w:txbxContent>
+                  <w:p>
+                    <w:pPr>
+                      <w:overflowPunct w:val="0"/>
+                      <w:spacing w:after="0" w:line="240" w:lineRule="auto"/>
+                    </w:pPr>
+                    <w:r>
+                      <w:rPr>
+                        <w:rFonts w:asciiTheme="minorHAnsi" w:eastAsiaTheme="minorEastAsia" w:hAnsiTheme="minorHAnsi" w:cstheme="minorBidi"/>
+                        <w:sz w:val="18"/>
+                      </w:rPr>
+                      <w:t xml:space="preserve"> </w:t>
+                    </w:r>
+                  </w:p>
+                </w:txbxContent>
+              </v:textbox>
+            </v:shape>
+            <v:shape id="Cuadro de texto 1103819227" o:spid="_x0000_s1168" type="#_x0000_t202" style="position:absolute;left:23716;top:52246;width:3874;height:1415;visibility:visible;mso-wrap-style:square;v-text-anchor:top" o:gfxdata="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" filled="f" stroked="f" strokeweight="0">
+              <v:textbox style="mso-next-textbox:#Cuadro de texto 1103819227" inset="0,0,0,0">
+                <w:txbxContent>
+                  <w:p>
+                    <w:pPr>
+                      <w:overflowPunct w:val="0"/>
+                      <w:spacing w:after="0" w:line="240" w:lineRule="auto"/>
+                    </w:pPr>
+                    <w:r>
+                      <w:rPr>
+                        <w:rFonts w:asciiTheme="minorHAnsi" w:eastAsiaTheme="minorEastAsia" w:hAnsiTheme="minorHAnsi" w:cstheme="minorBidi"/>
+                        <w:sz w:val="18"/>
+                      </w:rPr>
+                      <w:t>retiro:</w:t>
+                    </w:r>
+                  </w:p>
+                </w:txbxContent>
+              </v:textbox>
+            </v:shape>
+            <v:shape id="Cuadro de texto 729511673" o:spid="_x0000_s1169" type="#_x0000_t202" style="position:absolute;left:26640;top:52246;width:417;height:1415;visibility:visible;mso-wrap-style:square;v-text-anchor:top" o:gfxdata="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" filled="f" stroked="f" strokeweight="0">
+              <v:textbox style="mso-next-textbox:#Cuadro de texto 729511673" inset="0,0,0,0">
+                <w:txbxContent>
+                  <w:p>
+                    <w:pPr>
+                      <w:overflowPunct w:val="0"/>
+                      <w:spacing w:after="0" w:line="240" w:lineRule="auto"/>
+                    </w:pPr>
+                    <w:r>
+                      <w:rPr>
+                        <w:rFonts w:asciiTheme="minorHAnsi" w:eastAsiaTheme="minorEastAsia" w:hAnsiTheme="minorHAnsi" w:cstheme="minorBidi"/>
+                        <w:sz w:val="18"/>
+                      </w:rPr>
+                      <w:t xml:space="preserve"> </w:t>
+                    </w:r>
+                  </w:p>
+                </w:txbxContent>
+              </v:textbox>
+            </v:shape>
+            <v:shape id="Picture 2101" o:spid="_x0000_s1170" type="#_x0000_t75" style="position:absolute;left:284;top:93;width:57233;height:30651;visibility:visible;mso-wrap-style:square" o:gfxdata="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" filled="t" stroked="t" strokeweight="0">
+              <v:imagedata r:id="rId14" o:title=""/>
+            </v:shape>
+            <v:line id="Conector recto 336749100" o:spid="_x0000_s1171" style="position:absolute;visibility:visible;mso-wrap-style:square" from="190,50" to="57571,50" o:connectortype="straight" o:gfxdata="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" strokeweight="0"/>
+            <v:line id="Conector recto 483586114" o:spid="_x0000_s1172" style="position:absolute;visibility:visible;mso-wrap-style:square" from="57574,0" to="57574,30798" o:connectortype="straight" o:gfxdata="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" strokeweight="0"/>
+            <v:line id="Conector recto 1525699304" o:spid="_x0000_s1173" style="position:absolute;flip:x;visibility:visible;mso-wrap-style:square" from="241,30805" to="57621,30805" o:connectortype="straight" o:gfxdata="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" strokeweight="0"/>
+            <v:line id="Conector recto 1015539815" o:spid="_x0000_s1174" style="position:absolute;flip:y;visibility:visible;mso-wrap-style:square" from="241,50" to="241,30848" o:connectortype="straight" o:gfxdata="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" strokeweight="0"/>
+            <v:shape id="Picture 2107" o:spid="_x0000_s1175" type="#_x0000_t75" style="position:absolute;left:284;top:33984;width:43542;height:17031;visibility:visible;mso-wrap-style:square" o:gfxdata="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" filled="t" stroked="t" strokeweight="0">
+              <v:imagedata r:id="rId15" o:title=""/>
+            </v:shape>
+            <v:line id="Conector recto 183690848" o:spid="_x0000_s1176" style="position:absolute;visibility:visible;mso-wrap-style:square" from="190,33940" to="43880,33940" o:connectortype="straight" o:gfxdata="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" strokeweight="0"/>
+            <v:line id="Conector recto 1472346704" o:spid="_x0000_s1177" style="position:absolute;visibility:visible;mso-wrap-style:square" from="43884,33890" to="43884,51066" o:connectortype="straight" o:gfxdata="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" strokeweight="0"/>
+            <v:line id="Conector recto 41552457" o:spid="_x0000_s1178" style="position:absolute;flip:x;visibility:visible;mso-wrap-style:square" from="241,51073" to="43930,51073" o:connectortype="straight" o:gfxdata="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" strokeweight="0"/>
+            <v:line id="Conector recto 1739973804" o:spid="_x0000_s1179" style="position:absolute;flip:y;visibility:visible;mso-wrap-style:square" from="241,33940" to="241,51116" o:connectortype="straight" o:gfxdata="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" strokeweight="0"/>
+            <w10:anchorlock/>
+          </v:group>
+        </w:pict>
       </w:r>
       <w:r>
         <w:pict w14:anchorId="149FC276">
-          <v:group id="Group 14120" o:spid="_x0000_s1085" style="width:458.5pt;height:422.55pt;mso-position-horizontal-relative:char;mso-position-vertical-relative:line" coordsize="58230,53665" o:gfxdata="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">
+          <v:group id="_x0000_s1085" style="width:458.5pt;height:422.55pt;mso-position-horizontal-relative:char;mso-position-vertical-relative:line" coordsize="58230,53665">
             <v:shape id="Cuadro de texto 1021373637" o:spid="_x0000_s1086" type="#_x0000_t202" style="position:absolute;left:57808;top:30024;width:418;height:1414;visibility:visible;mso-wrap-style:square;v-text-anchor:top" o:gfxdata="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" filled="f" stroked="f" strokeweight="0">
-              <v:textbox inset="0,0,0,0">
+              <v:textbox style="mso-next-textbox:#Cuadro de texto 1021373637" inset="0,0,0,0">
                 <w:txbxContent>
                   <w:p>
                     <w:pPr>
@@ -2432,7 +3701,7 @@
               </v:textbox>
             </v:shape>
             <v:shape id="Cuadro de texto 1972133098" o:spid="_x0000_s1087" type="#_x0000_t202" style="position:absolute;top:31978;width:4806;height:1415;visibility:visible;mso-wrap-style:square;v-text-anchor:top" o:gfxdata="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" filled="f" stroked="f" strokeweight="0">
-              <v:textbox inset="0,0,0,0">
+              <v:textbox style="mso-next-textbox:#Cuadro de texto 1972133098" inset="0,0,0,0">
                 <w:txbxContent>
                   <w:p>
                     <w:pPr>
@@ -2451,7 +3720,7 @@
               </v:textbox>
             </v:shape>
             <v:shape id="Cuadro de texto 2134245649" o:spid="_x0000_s1088" type="#_x0000_t202" style="position:absolute;left:3614;top:31978;width:418;height:1415;visibility:visible;mso-wrap-style:square;v-text-anchor:top" o:gfxdata="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" filled="f" stroked="f" strokeweight="0">
-              <v:textbox inset="0,0,0,0">
+              <v:textbox style="mso-next-textbox:#Cuadro de texto 2134245649" inset="0,0,0,0">
                 <w:txbxContent>
                   <w:p>
                     <w:pPr>
@@ -2470,7 +3739,7 @@
               </v:textbox>
             </v:shape>
             <v:shape id="Cuadro de texto 609819071" o:spid="_x0000_s1089" type="#_x0000_t202" style="position:absolute;left:3931;top:31978;width:1677;height:1415;visibility:visible;mso-wrap-style:square;v-text-anchor:top" o:gfxdata="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" filled="f" stroked="f" strokeweight="0">
-              <v:textbox inset="0,0,0,0">
+              <v:textbox style="mso-next-textbox:#Cuadro de texto 609819071" inset="0,0,0,0">
                 <w:txbxContent>
                   <w:p>
                     <w:pPr>
@@ -2489,7 +3758,7 @@
               </v:textbox>
             </v:shape>
             <v:shape id="Cuadro de texto 1581744463" o:spid="_x0000_s1090" type="#_x0000_t202" style="position:absolute;left:5205;top:31978;width:414;height:1415;visibility:visible;mso-wrap-style:square;v-text-anchor:top" o:gfxdata="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" filled="f" stroked="f" strokeweight="0">
-              <v:textbox inset="0,0,0,0">
+              <v:textbox style="mso-next-textbox:#Cuadro de texto 1581744463" inset="0,0,0,0">
                 <w:txbxContent>
                   <w:p>
                     <w:pPr>
@@ -2508,7 +3777,7 @@
               </v:textbox>
             </v:shape>
             <v:shape id="Cuadro de texto 1352346082" o:spid="_x0000_s1091" type="#_x0000_t202" style="position:absolute;left:5518;top:31978;width:4382;height:1415;visibility:visible;mso-wrap-style:square;v-text-anchor:top" o:gfxdata="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" filled="f" stroked="f" strokeweight="0">
-              <v:textbox inset="0,0,0,0">
+              <v:textbox style="mso-next-textbox:#Cuadro de texto 1352346082" inset="0,0,0,0">
                 <w:txbxContent>
                   <w:p>
                     <w:pPr>
@@ -2527,7 +3796,7 @@
               </v:textbox>
             </v:shape>
             <v:shape id="Cuadro de texto 65551851" o:spid="_x0000_s1092" type="#_x0000_t202" style="position:absolute;left:8820;top:31978;width:414;height:1415;visibility:visible;mso-wrap-style:square;v-text-anchor:top" o:gfxdata="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" filled="f" stroked="f" strokeweight="0">
-              <v:textbox inset="0,0,0,0">
+              <v:textbox style="mso-next-textbox:#Cuadro de texto 65551851" inset="0,0,0,0">
                 <w:txbxContent>
                   <w:p>
                     <w:pPr>
@@ -2546,7 +3815,7 @@
               </v:textbox>
             </v:shape>
             <v:shape id="Cuadro de texto 570741714" o:spid="_x0000_s1093" type="#_x0000_t202" style="position:absolute;left:9129;top:31978;width:1681;height:1415;visibility:visible;mso-wrap-style:square;v-text-anchor:top" o:gfxdata="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" filled="f" stroked="f" strokeweight="0">
-              <v:textbox inset="0,0,0,0">
+              <v:textbox style="mso-next-textbox:#Cuadro de texto 570741714" inset="0,0,0,0">
                 <w:txbxContent>
                   <w:p>
                     <w:pPr>
@@ -2565,7 +3834,7 @@
               </v:textbox>
             </v:shape>
             <v:shape id="Cuadro de texto 445188604" o:spid="_x0000_s1094" type="#_x0000_t202" style="position:absolute;left:10400;top:31978;width:418;height:1415;visibility:visible;mso-wrap-style:square;v-text-anchor:top" o:gfxdata="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" filled="f" stroked="f" strokeweight="0">
-              <v:textbox inset="0,0,0,0">
+              <v:textbox style="mso-next-textbox:#Cuadro de texto 445188604" inset="0,0,0,0">
                 <w:txbxContent>
                   <w:p>
                     <w:pPr>
@@ -2584,7 +3853,7 @@
               </v:textbox>
             </v:shape>
             <v:shape id="Cuadro de texto 1095704472" o:spid="_x0000_s1095" type="#_x0000_t202" style="position:absolute;left:10717;top:31978;width:7589;height:1415;visibility:visible;mso-wrap-style:square;v-text-anchor:top" o:gfxdata="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" filled="f" stroked="f" strokeweight="0">
-              <v:textbox inset="0,0,0,0">
+              <v:textbox style="mso-next-textbox:#Cuadro de texto 1095704472" inset="0,0,0,0">
                 <w:txbxContent>
                   <w:p>
                     <w:pPr>
@@ -2603,7 +3872,7 @@
               </v:textbox>
             </v:shape>
             <v:shape id="Cuadro de texto 878059799" o:spid="_x0000_s1096" type="#_x0000_t202" style="position:absolute;left:16426;top:31978;width:418;height:1415;visibility:visible;mso-wrap-style:square;v-text-anchor:top" o:gfxdata="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" filled="f" stroked="f" strokeweight="0">
-              <v:textbox inset="0,0,0,0">
+              <v:textbox style="mso-next-textbox:#Cuadro de texto 878059799" inset="0,0,0,0">
                 <w:txbxContent>
                   <w:p>
                     <w:pPr>
@@ -2622,7 +3891,7 @@
               </v:textbox>
             </v:shape>
             <v:shape id="Cuadro de texto 104237298" o:spid="_x0000_s1097" type="#_x0000_t202" style="position:absolute;left:16743;top:31978;width:5479;height:1415;visibility:visible;mso-wrap-style:square;v-text-anchor:top" o:gfxdata="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" filled="f" stroked="f" strokeweight="0">
-              <v:textbox inset="0,0,0,0">
+              <v:textbox style="mso-next-textbox:#Cuadro de texto 104237298" inset="0,0,0,0">
                 <w:txbxContent>
                   <w:p>
                     <w:pPr>
@@ -2641,7 +3910,7 @@
               </v:textbox>
             </v:shape>
             <v:shape id="Cuadro de texto 905599247" o:spid="_x0000_s1098" type="#_x0000_t202" style="position:absolute;left:20865;top:31978;width:418;height:1415;visibility:visible;mso-wrap-style:square;v-text-anchor:top" o:gfxdata="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" filled="f" stroked="f" strokeweight="0">
-              <v:textbox inset="0,0,0,0">
+              <v:textbox style="mso-next-textbox:#Cuadro de texto 905599247" inset="0,0,0,0">
                 <w:txbxContent>
                   <w:p>
                     <w:pPr>
@@ -2660,7 +3929,7 @@
               </v:textbox>
             </v:shape>
             <v:shape id="Cuadro de texto 1452048959" o:spid="_x0000_s1099" type="#_x0000_t202" style="position:absolute;left:44121;top:50284;width:418;height:1415;visibility:visible;mso-wrap-style:square;v-text-anchor:top" o:gfxdata="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" filled="f" stroked="f" strokeweight="0">
-              <v:textbox inset="0,0,0,0">
+              <v:textbox style="mso-next-textbox:#Cuadro de texto 1452048959" inset="0,0,0,0">
                 <w:txbxContent>
                   <w:p>
                     <w:pPr>
@@ -2679,7 +3948,7 @@
               </v:textbox>
             </v:shape>
             <v:shape id="Cuadro de texto 321525396" o:spid="_x0000_s1100" type="#_x0000_t202" style="position:absolute;top:52246;width:6573;height:1415;visibility:visible;mso-wrap-style:square;v-text-anchor:top" o:gfxdata="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" filled="f" stroked="f" strokeweight="0">
-              <v:textbox inset="0,0,0,0">
+              <v:textbox style="mso-next-textbox:#Cuadro de texto 321525396" inset="0,0,0,0">
                 <w:txbxContent>
                   <w:p>
                     <w:pPr>
@@ -2698,7 +3967,7 @@
               </v:textbox>
             </v:shape>
             <v:shape id="Cuadro de texto 1519058171" o:spid="_x0000_s1101" type="#_x0000_t202" style="position:absolute;left:4946;top:52246;width:418;height:1415;visibility:visible;mso-wrap-style:square;v-text-anchor:top" o:gfxdata="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" filled="f" stroked="f" strokeweight="0">
-              <v:textbox inset="0,0,0,0">
+              <v:textbox style="mso-next-textbox:#Cuadro de texto 1519058171" inset="0,0,0,0">
                 <w:txbxContent>
                   <w:p>
                     <w:pPr>
@@ -2717,7 +3986,7 @@
               </v:textbox>
             </v:shape>
             <v:shape id="Cuadro de texto 1163804786" o:spid="_x0000_s1102" type="#_x0000_t202" style="position:absolute;left:5263;top:52246;width:831;height:1415;visibility:visible;mso-wrap-style:square;v-text-anchor:top" o:gfxdata="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" filled="f" stroked="f" strokeweight="0">
-              <v:textbox inset="0,0,0,0">
+              <v:textbox style="mso-next-textbox:#Cuadro de texto 1163804786" inset="0,0,0,0">
                 <w:txbxContent>
                   <w:p>
                     <w:pPr>
@@ -2736,7 +4005,7 @@
               </v:textbox>
             </v:shape>
             <v:shape id="Cuadro de texto 822741168" o:spid="_x0000_s1103" type="#_x0000_t202" style="position:absolute;left:5900;top:52246;width:418;height:1415;visibility:visible;mso-wrap-style:square;v-text-anchor:top" o:gfxdata="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" filled="f" stroked="f" strokeweight="0">
-              <v:textbox inset="0,0,0,0">
+              <v:textbox style="mso-next-textbox:#Cuadro de texto 822741168" inset="0,0,0,0">
                 <w:txbxContent>
                   <w:p>
                     <w:pPr>
@@ -2755,7 +4024,7 @@
               </v:textbox>
             </v:shape>
             <v:shape id="Cuadro de texto 316324874" o:spid="_x0000_s1104" type="#_x0000_t202" style="position:absolute;left:6217;top:52246;width:1937;height:1415;visibility:visible;mso-wrap-style:square;v-text-anchor:top" o:gfxdata="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" filled="f" stroked="f" strokeweight="0">
-              <v:textbox inset="0,0,0,0">
+              <v:textbox style="mso-next-textbox:#Cuadro de texto 316324874" inset="0,0,0,0">
                 <w:txbxContent>
                   <w:p>
                     <w:pPr>
@@ -2774,7 +4043,7 @@
               </v:textbox>
             </v:shape>
             <v:shape id="Cuadro de texto 684096198" o:spid="_x0000_s1105" type="#_x0000_t202" style="position:absolute;left:7678;top:52246;width:418;height:1415;visibility:visible;mso-wrap-style:square;v-text-anchor:top" o:gfxdata="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" filled="f" stroked="f" strokeweight="0">
-              <v:textbox inset="0,0,0,0">
+              <v:textbox style="mso-next-textbox:#Cuadro de texto 684096198" inset="0,0,0,0">
                 <w:txbxContent>
                   <w:p>
                     <w:pPr>
@@ -2793,7 +4062,7 @@
               </v:textbox>
             </v:shape>
             <v:shape id="Cuadro de texto 1988477773" o:spid="_x0000_s1106" type="#_x0000_t202" style="position:absolute;left:7995;top:52246;width:4637;height:1415;visibility:visible;mso-wrap-style:square;v-text-anchor:top" o:gfxdata="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" filled="f" stroked="f" strokeweight="0">
-              <v:textbox inset="0,0,0,0">
+              <v:textbox style="mso-next-textbox:#Cuadro de texto 1988477773" inset="0,0,0,0">
                 <w:txbxContent>
                   <w:p>
                     <w:pPr>
@@ -2812,7 +4081,7 @@
               </v:textbox>
             </v:shape>
             <v:shape id="Cuadro de texto 1195909562" o:spid="_x0000_s1107" type="#_x0000_t202" style="position:absolute;left:11480;top:52246;width:418;height:1415;visibility:visible;mso-wrap-style:square;v-text-anchor:top" o:gfxdata="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" filled="f" stroked="f" strokeweight="0">
-              <v:textbox inset="0,0,0,0">
+              <v:textbox style="mso-next-textbox:#Cuadro de texto 1195909562" inset="0,0,0,0">
                 <w:txbxContent>
                   <w:p>
                     <w:pPr>
@@ -2831,7 +4100,7 @@
               </v:textbox>
             </v:shape>
             <v:shape id="Cuadro de texto 1066020643" o:spid="_x0000_s1108" type="#_x0000_t202" style="position:absolute;left:11797;top:52246;width:7923;height:1415;visibility:visible;mso-wrap-style:square;v-text-anchor:top" o:gfxdata="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" filled="f" stroked="f" strokeweight="0">
-              <v:textbox inset="0,0,0,0">
+              <v:textbox style="mso-next-textbox:#Cuadro de texto 1066020643" inset="0,0,0,0">
                 <w:txbxContent>
                   <w:p>
                     <w:pPr>
@@ -2850,7 +4119,7 @@
               </v:textbox>
             </v:shape>
             <v:shape id="Cuadro de texto 664146888" o:spid="_x0000_s1109" type="#_x0000_t202" style="position:absolute;left:17762;top:52246;width:418;height:1415;visibility:visible;mso-wrap-style:square;v-text-anchor:top" o:gfxdata="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" filled="f" stroked="f" strokeweight="0">
-              <v:textbox inset="0,0,0,0">
+              <v:textbox style="mso-next-textbox:#Cuadro de texto 664146888" inset="0,0,0,0">
                 <w:txbxContent>
                   <w:p>
                     <w:pPr>
@@ -2869,7 +4138,7 @@
               </v:textbox>
             </v:shape>
             <v:shape id="Cuadro de texto 862339742" o:spid="_x0000_s1110" type="#_x0000_t202" style="position:absolute;left:18079;top:52246;width:1681;height:1415;visibility:visible;mso-wrap-style:square;v-text-anchor:top" o:gfxdata="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" filled="f" stroked="f" strokeweight="0">
-              <v:textbox inset="0,0,0,0">
+              <v:textbox style="mso-next-textbox:#Cuadro de texto 862339742" inset="0,0,0,0">
                 <w:txbxContent>
                   <w:p>
                     <w:pPr>
@@ -2888,7 +4157,7 @@
               </v:textbox>
             </v:shape>
             <v:shape id="Cuadro de texto 758058197" o:spid="_x0000_s1111" type="#_x0000_t202" style="position:absolute;left:19350;top:52246;width:417;height:1415;visibility:visible;mso-wrap-style:square;v-text-anchor:top" o:gfxdata="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" filled="f" stroked="f" strokeweight="0">
-              <v:textbox inset="0,0,0,0">
+              <v:textbox style="mso-next-textbox:#Cuadro de texto 758058197" inset="0,0,0,0">
                 <w:txbxContent>
                   <w:p>
                     <w:pPr>
@@ -2907,7 +4176,7 @@
               </v:textbox>
             </v:shape>
             <v:shape id="Cuadro de texto 1048172622" o:spid="_x0000_s1112" type="#_x0000_t202" style="position:absolute;left:19666;top:52246;width:3366;height:1415;visibility:visible;mso-wrap-style:square;v-text-anchor:top" o:gfxdata="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" filled="f" stroked="f" strokeweight="0">
-              <v:textbox inset="0,0,0,0">
+              <v:textbox style="mso-next-textbox:#Cuadro de texto 1048172622" inset="0,0,0,0">
                 <w:txbxContent>
                   <w:p>
                     <w:pPr>
@@ -2926,7 +4195,7 @@
               </v:textbox>
             </v:shape>
             <v:shape id="Cuadro de texto 294066993" o:spid="_x0000_s1113" type="#_x0000_t202" style="position:absolute;left:22201;top:52246;width:417;height:1415;visibility:visible;mso-wrap-style:square;v-text-anchor:top" o:gfxdata="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" filled="f" stroked="f" strokeweight="0">
-              <v:textbox inset="0,0,0,0">
+              <v:textbox style="mso-next-textbox:#Cuadro de texto 294066993" inset="0,0,0,0">
                 <w:txbxContent>
                   <w:p>
                     <w:pPr>
@@ -2945,7 +4214,7 @@
               </v:textbox>
             </v:shape>
             <v:shape id="Cuadro de texto 383925049" o:spid="_x0000_s1114" type="#_x0000_t202" style="position:absolute;left:22518;top:52246;width:1170;height:1415;visibility:visible;mso-wrap-style:square;v-text-anchor:top" o:gfxdata="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" filled="f" stroked="f" strokeweight="0">
-              <v:textbox inset="0,0,0,0">
+              <v:textbox style="mso-next-textbox:#Cuadro de texto 383925049" inset="0,0,0,0">
                 <w:txbxContent>
                   <w:p>
                     <w:pPr>
@@ -2964,7 +4233,7 @@
               </v:textbox>
             </v:shape>
             <v:shape id="Cuadro de texto 707916133" o:spid="_x0000_s1115" type="#_x0000_t202" style="position:absolute;left:23407;top:52246;width:414;height:1415;visibility:visible;mso-wrap-style:square;v-text-anchor:top" o:gfxdata="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" filled="f" stroked="f" strokeweight="0">
-              <v:textbox inset="0,0,0,0">
+              <v:textbox style="mso-next-textbox:#Cuadro de texto 707916133" inset="0,0,0,0">
                 <w:txbxContent>
                   <w:p>
                     <w:pPr>
@@ -2983,7 +4252,7 @@
               </v:textbox>
             </v:shape>
             <v:shape id="Cuadro de texto 1103819227" o:spid="_x0000_s1116" type="#_x0000_t202" style="position:absolute;left:23716;top:52246;width:3874;height:1415;visibility:visible;mso-wrap-style:square;v-text-anchor:top" o:gfxdata="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" filled="f" stroked="f" strokeweight="0">
-              <v:textbox inset="0,0,0,0">
+              <v:textbox style="mso-next-textbox:#Cuadro de texto 1103819227" inset="0,0,0,0">
                 <w:txbxContent>
                   <w:p>
                     <w:pPr>
@@ -3002,7 +4271,7 @@
               </v:textbox>
             </v:shape>
             <v:shape id="Cuadro de texto 729511673" o:spid="_x0000_s1117" type="#_x0000_t202" style="position:absolute;left:26640;top:52246;width:417;height:1415;visibility:visible;mso-wrap-style:square;v-text-anchor:top" o:gfxdata="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" filled="f" stroked="f" strokeweight="0">
-              <v:textbox inset="0,0,0,0">
+              <v:textbox style="mso-next-textbox:#Cuadro de texto 729511673" inset="0,0,0,0">
                 <w:txbxContent>
                   <w:p>
                     <w:pPr>
@@ -3021,14 +4290,14 @@
               </v:textbox>
             </v:shape>
             <v:shape id="Picture 2101" o:spid="_x0000_s1118" type="#_x0000_t75" style="position:absolute;left:284;top:93;width:57233;height:30651;visibility:visible;mso-wrap-style:square" o:gfxdata="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" filled="t" stroked="t" strokeweight="0">
-              <v:imagedata r:id="rId13" o:title=""/>
+              <v:imagedata r:id="rId14" o:title=""/>
             </v:shape>
             <v:line id="Conector recto 336749100" o:spid="_x0000_s1119" style="position:absolute;visibility:visible;mso-wrap-style:square" from="190,50" to="57571,50" o:connectortype="straight" o:gfxdata="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" strokeweight="0"/>
             <v:line id="Conector recto 483586114" o:spid="_x0000_s1120" style="position:absolute;visibility:visible;mso-wrap-style:square" from="57574,0" to="57574,30798" o:connectortype="straight" o:gfxdata="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" strokeweight="0"/>
             <v:line id="Conector recto 1525699304" o:spid="_x0000_s1121" style="position:absolute;flip:x;visibility:visible;mso-wrap-style:square" from="241,30805" to="57621,30805" o:connectortype="straight" o:gfxdata="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" strokeweight="0"/>
             <v:line id="Conector recto 1015539815" o:spid="_x0000_s1122" style="position:absolute;flip:y;visibility:visible;mso-wrap-style:square" from="241,50" to="241,30848" o:connectortype="straight" o:gfxdata="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" strokeweight="0"/>
             <v:shape id="Picture 2107" o:spid="_x0000_s1123" type="#_x0000_t75" style="position:absolute;left:284;top:33984;width:43542;height:17031;visibility:visible;mso-wrap-style:square" o:gfxdata="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" filled="t" stroked="t" strokeweight="0">
-              <v:imagedata r:id="rId14" o:title=""/>
+              <v:imagedata r:id="rId15" o:title=""/>
             </v:shape>
             <v:line id="Conector recto 183690848" o:spid="_x0000_s1124" style="position:absolute;visibility:visible;mso-wrap-style:square" from="190,33940" to="43880,33940" o:connectortype="straight" o:gfxdata="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" strokeweight="0"/>
             <v:line id="Conector recto 1472346704" o:spid="_x0000_s1125" style="position:absolute;visibility:visible;mso-wrap-style:square" from="43884,33890" to="43884,51066" o:connectortype="straight" o:gfxdata="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" strokeweight="0"/>
@@ -3048,15 +4317,10 @@
         </w:rPr>
       </w:pPr>
       <w:r>
-        <w:rPr>
-          <w:noProof/>
-        </w:rPr>
-      </w:r>
-      <w:r>
         <w:pict w14:anchorId="31D2899B">
-          <v:group id="Group 13936" o:spid="_x0000_s1077" style="width:458.5pt;height:290.8pt;mso-position-horizontal-relative:char;mso-position-vertical-relative:line" coordsize="58230,36932" o:gfxdata="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">
+          <v:group id="Group 13936" o:spid="_x0000_s1077" style="width:458.5pt;height:290.8pt;mso-position-horizontal-relative:char;mso-position-vertical-relative:line" coordsize="58230,36932">
             <v:shape id="Cuadro de texto 1615641859" o:spid="_x0000_s1078" type="#_x0000_t202" style="position:absolute;left:57808;top:33566;width:418;height:1411;visibility:visible;mso-wrap-style:square;v-text-anchor:top" o:gfxdata="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" filled="f" stroked="f" strokeweight="0">
-              <v:textbox inset="0,0,0,0">
+              <v:textbox style="mso-next-textbox:#Cuadro de texto 1615641859" inset="0,0,0,0">
                 <w:txbxContent>
                   <w:p>
                     <w:pPr>
@@ -3075,7 +4339,7 @@
               </v:textbox>
             </v:shape>
             <v:shape id="Cuadro de texto 3891746" o:spid="_x0000_s1079" type="#_x0000_t202" style="position:absolute;top:35521;width:417;height:1411;visibility:visible;mso-wrap-style:square;v-text-anchor:top" o:gfxdata="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" filled="f" stroked="f" strokeweight="0">
-              <v:textbox inset="0,0,0,0">
+              <v:textbox style="mso-next-textbox:#Cuadro de texto 3891746" inset="0,0,0,0">
                 <w:txbxContent>
                   <w:p>
                     <w:pPr>
@@ -3094,7 +4358,7 @@
               </v:textbox>
             </v:shape>
             <v:shape id="Picture 2208" o:spid="_x0000_s1080" type="#_x0000_t75" style="position:absolute;left:284;top:50;width:57233;height:34247;visibility:visible;mso-wrap-style:square" o:gfxdata="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" filled="t" stroked="t" strokeweight="0">
-              <v:imagedata r:id="rId15" o:title=""/>
+              <v:imagedata r:id="rId16" o:title=""/>
             </v:shape>
             <v:line id="Conector recto 344214451" o:spid="_x0000_s1081" style="position:absolute;visibility:visible;mso-wrap-style:square" from="190,50" to="57571,50" o:connectortype="straight" o:gfxdata="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" strokeweight="0"/>
             <v:line id="Conector recto 993045218" o:spid="_x0000_s1082" style="position:absolute;visibility:visible;mso-wrap-style:square" from="57574,0" to="57574,34390" o:connectortype="straight" o:gfxdata="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" strokeweight="0"/>
@@ -3103,67 +4367,6 @@
             <w10:anchorlock/>
           </v:group>
         </w:pict>
-      </w:r>
-    </w:p>
-    <w:p>
-      <w:pPr>
-        <w:spacing w:after="0" w:line="240" w:lineRule="auto"/>
-        <w:ind w:left="-5" w:hanging="10"/>
-      </w:pPr>
-      <w:r>
-        <w:rPr>
-          <w:rFonts w:ascii="Arial" w:eastAsia="Arial" w:hAnsi="Arial" w:cs="Arial"/>
-          <w:sz w:val="18"/>
-        </w:rPr>
-        <w:t>Esta pagina es para organizar un retiro, no para que el usuario asista</w:t>
-      </w:r>
-      <w:r>
-        <w:rPr>
-          <w:rFonts w:ascii="Arial" w:eastAsia="Arial" w:hAnsi="Arial" w:cs="Arial"/>
-          <w:sz w:val="18"/>
-          <w:shd w:val="clear" w:color="auto" w:fill="FFFF00"/>
-        </w:rPr>
-        <w:t xml:space="preserve"> (creo que no va):</w:t>
-      </w:r>
-      <w:r>
-        <w:rPr>
-          <w:rFonts w:ascii="Arial" w:eastAsia="Arial" w:hAnsi="Arial" w:cs="Arial"/>
-          <w:sz w:val="18"/>
-        </w:rPr>
-        <w:t xml:space="preserve"> </w:t>
-      </w:r>
-      <w:hyperlink r:id="rId16">
-        <w:r>
-          <w:rPr>
-            <w:rFonts w:ascii="Arial" w:eastAsia="Arial" w:hAnsi="Arial" w:cs="Arial"/>
-            <w:color w:val="1155CC"/>
-            <w:sz w:val="18"/>
-            <w:u w:val="single" w:color="1155CC"/>
-          </w:rPr>
-          <w:t>https://hoteluritorco.com/experiencias-grupales-retiros/</w:t>
-        </w:r>
-      </w:hyperlink>
-      <w:r>
-        <w:rPr>
-          <w:rFonts w:ascii="Arial" w:eastAsia="Arial" w:hAnsi="Arial" w:cs="Arial"/>
-          <w:sz w:val="18"/>
-        </w:rPr>
-        <w:t xml:space="preserve"> </w:t>
-      </w:r>
-    </w:p>
-    <w:p>
-      <w:pPr>
-        <w:spacing w:after="87" w:line="240" w:lineRule="auto"/>
-        <w:rPr>
-          <w:rFonts w:ascii="Arial" w:hAnsi="Arial"/>
-        </w:rPr>
-      </w:pPr>
-      <w:r>
-        <w:rPr>
-          <w:rFonts w:ascii="Arial" w:eastAsia="Arial" w:hAnsi="Arial" w:cs="Arial"/>
-          <w:sz w:val="18"/>
-        </w:rPr>
-        <w:t xml:space="preserve"> </w:t>
       </w:r>
     </w:p>
     <w:p>
@@ -3231,22 +4434,6 @@
     </w:p>
     <w:p>
       <w:pPr>
-        <w:spacing w:after="0" w:line="240" w:lineRule="auto"/>
-        <w:ind w:left="-5" w:hanging="10"/>
-        <w:rPr>
-          <w:rFonts w:ascii="Arial" w:hAnsi="Arial"/>
-        </w:rPr>
-      </w:pPr>
-      <w:r>
-        <w:rPr>
-          <w:rFonts w:ascii="Arial" w:eastAsia="Arial" w:hAnsi="Arial" w:cs="Arial"/>
-          <w:sz w:val="18"/>
-        </w:rPr>
-        <w:t xml:space="preserve">Video explicativo, abarca información general sobre el retiro: </w:t>
-      </w:r>
-    </w:p>
-    <w:p>
-      <w:pPr>
         <w:spacing w:after="141" w:line="240" w:lineRule="auto"/>
         <w:ind w:left="30" w:right="-30"/>
         <w:rPr>
@@ -3254,13 +4441,11 @@
         </w:rPr>
       </w:pPr>
       <w:r>
-        <w:rPr>
-          <w:noProof/>
-        </w:rPr>
+        <w:t>Se relevó la existencia de material audiovisual que proporciona información general sobre el retiro, permitiendo identificar características, actividades y aspectos relevantes para el registro de información dentro del sistema.</w:t>
       </w:r>
       <w:r>
         <w:pict w14:anchorId="5F2EABDE">
-          <v:group id="Group 13937" o:spid="_x0000_s1070" style="width:457pt;height:266.3pt;mso-position-horizontal-relative:char;mso-position-vertical-relative:line" coordsize="58039,33818" o:gfxdata="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">
+          <v:group id="Group 13937" o:spid="_x0000_s1070" style="width:457pt;height:266.3pt;mso-position-horizontal-relative:char;mso-position-vertical-relative:line" coordsize="58039,33818">
             <v:shape id="Cuadro de texto 966845656" o:spid="_x0000_s1071" type="#_x0000_t202" style="position:absolute;left:57621;top:32410;width:418;height:1412;visibility:visible;mso-wrap-style:square;v-text-anchor:top" o:gfxdata="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" filled="f" stroked="f" strokeweight="0">
               <v:textbox inset="0,0,0,0">
                 <w:txbxContent>
@@ -3294,25 +4479,71 @@
     </w:p>
     <w:p>
       <w:pPr>
-        <w:spacing w:after="83" w:line="240" w:lineRule="auto"/>
-        <w:ind w:left="-5" w:hanging="10"/>
-        <w:rPr>
-          <w:rFonts w:ascii="Arial" w:hAnsi="Arial"/>
-        </w:rPr>
-      </w:pPr>
-      <w:r>
-        <w:rPr>
-          <w:rFonts w:ascii="Arial" w:eastAsia="Arial" w:hAnsi="Arial" w:cs="Arial"/>
-          <w:sz w:val="18"/>
-        </w:rPr>
-        <w:t xml:space="preserve">Precios de los programas: </w:t>
-      </w:r>
-    </w:p>
-    <w:p>
-      <w:pPr>
         <w:spacing w:after="87" w:line="240" w:lineRule="auto"/>
         <w:jc w:val="right"/>
         <w:rPr>
+          <w:rFonts w:ascii="Arial" w:eastAsia="Arial" w:hAnsi="Arial" w:cs="Arial"/>
+          <w:sz w:val="18"/>
+        </w:rPr>
+      </w:pPr>
+    </w:p>
+    <w:p>
+      <w:pPr>
+        <w:spacing w:after="87" w:line="240" w:lineRule="auto"/>
+        <w:jc w:val="right"/>
+        <w:rPr>
+          <w:rFonts w:ascii="Arial" w:eastAsia="Arial" w:hAnsi="Arial" w:cs="Arial"/>
+          <w:sz w:val="18"/>
+        </w:rPr>
+      </w:pPr>
+    </w:p>
+    <w:p>
+      <w:pPr>
+        <w:spacing w:after="87" w:line="240" w:lineRule="auto"/>
+        <w:jc w:val="right"/>
+        <w:rPr>
+          <w:rFonts w:ascii="Arial" w:eastAsia="Arial" w:hAnsi="Arial" w:cs="Arial"/>
+          <w:sz w:val="18"/>
+        </w:rPr>
+      </w:pPr>
+      <w:r>
+        <w:rPr>
+          <w:rFonts w:ascii="Arial" w:eastAsia="Arial" w:hAnsi="Arial" w:cs="Arial"/>
+          <w:sz w:val="18"/>
+        </w:rPr>
+        <w:lastRenderedPageBreak/>
+        <w:t>Se relevó información sobre los costos de los distintos programas disponibles, permitiendo identificar la necesida</w:t>
+      </w:r>
+      <w:r>
+        <w:rPr>
+          <w:rFonts w:ascii="Arial" w:eastAsia="Arial" w:hAnsi="Arial" w:cs="Arial"/>
+          <w:sz w:val="18"/>
+        </w:rPr>
+        <w:t xml:space="preserve">d </w:t>
+      </w:r>
+      <w:r>
+        <w:rPr>
+          <w:rFonts w:ascii="Arial" w:eastAsia="Arial" w:hAnsi="Arial" w:cs="Arial"/>
+          <w:sz w:val="18"/>
+        </w:rPr>
+        <w:t>de registrar precios y modalidades de contratación dentro del sistema.</w:t>
+      </w:r>
+    </w:p>
+    <w:p>
+      <w:pPr>
+        <w:spacing w:after="87" w:line="240" w:lineRule="auto"/>
+        <w:jc w:val="right"/>
+        <w:rPr>
+          <w:rFonts w:ascii="Arial" w:eastAsia="Arial" w:hAnsi="Arial" w:cs="Arial"/>
+          <w:sz w:val="18"/>
+        </w:rPr>
+      </w:pPr>
+    </w:p>
+    <w:p>
+      <w:pPr>
+        <w:spacing w:after="87" w:line="240" w:lineRule="auto"/>
+        <w:jc w:val="right"/>
+        <w:rPr>
           <w:rFonts w:ascii="Arial" w:hAnsi="Arial"/>
         </w:rPr>
       </w:pPr>
@@ -3321,7 +4552,6 @@
           <w:rFonts w:ascii="Arial" w:hAnsi="Arial"/>
           <w:noProof/>
         </w:rPr>
-        <w:lastRenderedPageBreak/>
         <w:drawing>
           <wp:inline distT="0" distB="0" distL="0" distR="0" wp14:anchorId="04D85530" wp14:editId="04D85531">
             <wp:extent cx="5734050" cy="3238500"/>
@@ -3386,28 +4616,15 @@
     </w:p>
     <w:p>
       <w:pPr>
-        <w:spacing w:after="83" w:line="240" w:lineRule="auto"/>
-        <w:ind w:left="-5" w:hanging="10"/>
-        <w:rPr>
-          <w:rFonts w:ascii="Arial" w:hAnsi="Arial"/>
-        </w:rPr>
-      </w:pPr>
-      <w:r>
-        <w:rPr>
-          <w:rFonts w:ascii="Arial" w:eastAsia="Arial" w:hAnsi="Arial" w:cs="Arial"/>
-          <w:sz w:val="18"/>
-        </w:rPr>
-        <w:t xml:space="preserve">Imagenes de retiros anteriores: </w:t>
-      </w:r>
-    </w:p>
-    <w:p>
-      <w:pPr>
         <w:spacing w:after="87" w:line="240" w:lineRule="auto"/>
         <w:jc w:val="right"/>
         <w:rPr>
           <w:rFonts w:ascii="Arial" w:hAnsi="Arial"/>
         </w:rPr>
       </w:pPr>
+      <w:r>
+        <w:t>Presenta una galería de imágenes de retiros realizados anteriormente, permitiendo visualizar las instalaciones, actividades desarrolladas y experiencias de los participantes</w:t>
+      </w:r>
       <w:r>
         <w:rPr>
           <w:rFonts w:ascii="Arial" w:hAnsi="Arial"/>
@@ -3477,27 +4694,18 @@
     </w:p>
     <w:p>
       <w:pPr>
-        <w:spacing w:after="83" w:line="240" w:lineRule="auto"/>
-        <w:ind w:left="-5" w:hanging="10"/>
-        <w:rPr>
-          <w:rFonts w:ascii="Arial" w:hAnsi="Arial"/>
-        </w:rPr>
-      </w:pPr>
-      <w:r>
-        <w:rPr>
-          <w:rFonts w:ascii="Arial" w:eastAsia="Arial" w:hAnsi="Arial" w:cs="Arial"/>
-          <w:sz w:val="18"/>
-        </w:rPr>
-        <w:t xml:space="preserve">Formulario de contacto y ubicación: </w:t>
-      </w:r>
-    </w:p>
-    <w:p>
-      <w:pPr>
         <w:spacing w:after="0" w:line="240" w:lineRule="auto"/>
         <w:rPr>
           <w:rFonts w:ascii="Arial" w:hAnsi="Arial"/>
         </w:rPr>
       </w:pPr>
+      <w:r>
+        <w:rPr>
+          <w:rFonts w:ascii="Arial" w:eastAsia="Arial" w:hAnsi="Arial" w:cs="Arial"/>
+          <w:sz w:val="18"/>
+        </w:rPr>
+        <w:t>Dispone de un formulario de contacto para realizar consultas o solicitar información adicional, además de proporcionar la ubicación del establecimiento donde se desarrollan las actividades.</w:t>
+      </w:r>
       <w:r>
         <w:rPr>
           <w:rFonts w:ascii="Arial" w:eastAsia="Arial" w:hAnsi="Arial" w:cs="Arial"/>
@@ -3521,9 +4729,25 @@
         </w:rPr>
         <w:lastRenderedPageBreak/>
         <w:drawing>
-          <wp:inline distT="0" distB="0" distL="0" distR="0" wp14:anchorId="04D85534" wp14:editId="04D85535">
+          <wp:anchor distT="0" distB="0" distL="114300" distR="114300" simplePos="0" relativeHeight="251658240" behindDoc="1" locked="0" layoutInCell="1" allowOverlap="1" wp14:anchorId="04D85534" wp14:editId="07B56981">
+            <wp:simplePos x="0" y="0"/>
+            <wp:positionH relativeFrom="column">
+              <wp:posOffset>60960</wp:posOffset>
+            </wp:positionH>
+            <wp:positionV relativeFrom="paragraph">
+              <wp:posOffset>3810</wp:posOffset>
+            </wp:positionV>
             <wp:extent cx="5734050" cy="3076575"/>
             <wp:effectExtent l="0" t="0" r="0" b="0"/>
+            <wp:wrapThrough wrapText="bothSides">
+              <wp:wrapPolygon edited="0">
+                <wp:start x="0" y="0"/>
+                <wp:lineTo x="0" y="21533"/>
+                <wp:lineTo x="21528" y="21533"/>
+                <wp:lineTo x="21528" y="0"/>
+                <wp:lineTo x="0" y="0"/>
+              </wp:wrapPolygon>
+            </wp:wrapThrough>
             <wp:docPr id="14" name="Picture 2321"/>
             <wp:cNvGraphicFramePr>
               <a:graphicFrameLocks xmlns:a="http://schemas.openxmlformats.org/drawingml/2006/main" noChangeAspect="1"/>
@@ -3538,7 +4762,13 @@
                     </pic:cNvPicPr>
                   </pic:nvPicPr>
                   <pic:blipFill>
-                    <a:blip r:embed="rId21"/>
+                    <a:blip r:embed="rId21">
+                      <a:extLst>
+                        <a:ext uri="{28A0092B-C50C-407E-A947-70E740481C1C}">
+                          <a14:useLocalDpi xmlns:a14="http://schemas.microsoft.com/office/drawing/2010/main" val="0"/>
+                        </a:ext>
+                      </a:extLst>
+                    </a:blip>
                     <a:stretch>
                       <a:fillRect/>
                     </a:stretch>
@@ -3556,7 +4786,7 @@
                 </pic:pic>
               </a:graphicData>
             </a:graphic>
-          </wp:inline>
+          </wp:anchor>
         </w:drawing>
       </w:r>
       <w:r>
@@ -3655,13 +4885,8 @@
         </w:rPr>
       </w:pPr>
       <w:r>
-        <w:rPr>
-          <w:noProof/>
-        </w:rPr>
-      </w:r>
-      <w:r>
         <w:pict w14:anchorId="221B3669">
-          <v:group id="Group 13482" o:spid="_x0000_s1049" style="width:458.5pt;height:247.05pt;mso-position-horizontal-relative:char;mso-position-vertical-relative:line" coordsize="58230,31374" o:gfxdata="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">
+          <v:group id="Group 13482" o:spid="_x0000_s1049" style="width:458.5pt;height:247.05pt;mso-position-horizontal-relative:char;mso-position-vertical-relative:line" coordsize="58230,31374">
             <v:shape id="Cuadro de texto 1413906796" o:spid="_x0000_s1050" type="#_x0000_t202" style="position:absolute;width:8852;height:1411;visibility:visible;mso-wrap-style:square;v-text-anchor:top" o:gfxdata="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" filled="f" stroked="f" strokeweight="0">
               <v:textbox inset="0,0,0,0">
                 <w:txbxContent>
@@ -3968,13 +5193,8 @@
         </w:rPr>
       </w:pPr>
       <w:r>
-        <w:rPr>
-          <w:noProof/>
-        </w:rPr>
-      </w:r>
-      <w:r>
         <w:pict w14:anchorId="16185717">
-          <v:group id="Group 14340" o:spid="_x0000_s1041" style="width:458.5pt;height:220.3pt;mso-position-horizontal-relative:char;mso-position-vertical-relative:line" coordsize="58230,27979" o:gfxdata="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">
+          <v:group id="Group 14340" o:spid="_x0000_s1041" style="width:458.5pt;height:220.3pt;mso-position-horizontal-relative:char;mso-position-vertical-relative:line" coordsize="58230,27979">
             <v:shape id="Cuadro de texto 159190001" o:spid="_x0000_s1042" type="#_x0000_t202" style="position:absolute;left:57808;top:24624;width:418;height:1404;visibility:visible;mso-wrap-style:square;v-text-anchor:top" o:gfxdata="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" filled="f" stroked="f" strokeweight="0">
               <v:textbox inset="0,0,0,0">
                 <w:txbxContent>
@@ -4027,22 +5247,6 @@
     </w:p>
     <w:p>
       <w:pPr>
-        <w:spacing w:after="0" w:line="240" w:lineRule="auto"/>
-        <w:ind w:left="-5" w:hanging="10"/>
-        <w:rPr>
-          <w:rFonts w:ascii="Arial" w:hAnsi="Arial"/>
-        </w:rPr>
-      </w:pPr>
-      <w:r>
-        <w:rPr>
-          <w:rFonts w:ascii="Arial" w:eastAsia="Arial" w:hAnsi="Arial" w:cs="Arial"/>
-          <w:sz w:val="18"/>
-        </w:rPr>
-        <w:t xml:space="preserve">Agenda y actividades diarias. </w:t>
-      </w:r>
-    </w:p>
-    <w:p>
-      <w:pPr>
         <w:spacing w:after="141" w:line="240" w:lineRule="auto"/>
         <w:ind w:left="30"/>
         <w:rPr>
@@ -4050,14 +5254,24 @@
         </w:rPr>
       </w:pPr>
       <w:r>
-        <w:rPr>
-          <w:noProof/>
-        </w:rPr>
-      </w:r>
-      <w:r>
-        <w:pict w14:anchorId="1D9FD12F">
-          <v:group id="Group 14341" o:spid="_x0000_s1034" style="width:332.5pt;height:364.9pt;mso-position-horizontal-relative:char;mso-position-vertical-relative:line" coordsize="42228,46342" o:gfxdata="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">
-            <v:shape id="Cuadro de texto 595414710" o:spid="_x0000_s1035" type="#_x0000_t202" style="position:absolute;left:41806;top:44931;width:418;height:1411;visibility:visible;mso-wrap-style:square;v-text-anchor:top" o:gfxdata="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" filled="f" stroked="f" strokeweight="0">
+        <w:t>Presenta una agenda detallada con la planificación de las actividades que se desarrollarán durante cada jornada del retiro, incluyendo horarios y descripción de las dinámicas propuestas.</w:t>
+      </w:r>
+      <w:r>
+        <w:rPr>
+          <w:rFonts w:ascii="Arial" w:hAnsi="Arial"/>
+        </w:rPr>
+        <w:t xml:space="preserve"> </w:t>
+      </w:r>
+    </w:p>
+    <w:p>
+      <w:pPr>
+        <w:spacing w:after="83" w:line="240" w:lineRule="auto"/>
+        <w:ind w:left="-5" w:hanging="10"/>
+      </w:pPr>
+      <w:r>
+        <w:pict w14:anchorId="2CEB2EAA">
+          <v:group id="Group 14341" o:spid="_x0000_s1180" style="width:332.5pt;height:364.9pt;mso-position-horizontal-relative:char;mso-position-vertical-relative:line" coordsize="42228,46342">
+            <v:shape id="Cuadro de texto 595414710" o:spid="_x0000_s1181" type="#_x0000_t202" style="position:absolute;left:41806;top:44931;width:418;height:1411;visibility:visible;mso-wrap-style:square;v-text-anchor:top" o:gfxdata="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" filled="f" stroked="f" strokeweight="0">
               <v:textbox inset="0,0,0,0">
                 <w:txbxContent>
                   <w:p>
@@ -4076,13 +5290,13 @@
                 </w:txbxContent>
               </v:textbox>
             </v:shape>
-            <v:shape id="Picture 2370" o:spid="_x0000_s1036" type="#_x0000_t75" style="position:absolute;left:93;top:93;width:41422;height:45562;visibility:visible;mso-wrap-style:square" o:gfxdata="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" filled="t" stroked="t" strokeweight="0">
+            <v:shape id="Picture 2370" o:spid="_x0000_s1182" type="#_x0000_t75" style="position:absolute;left:93;top:93;width:41422;height:45562;visibility:visible;mso-wrap-style:square" o:gfxdata="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" filled="t" stroked="t" strokeweight="0">
               <v:imagedata r:id="rId25" o:title=""/>
             </v:shape>
-            <v:line id="Conector recto 322705081" o:spid="_x0000_s1037" style="position:absolute;visibility:visible;mso-wrap-style:square" from="0,50" to="41565,50" o:connectortype="straight" o:gfxdata="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" strokeweight="0"/>
-            <v:line id="Conector recto 933020994" o:spid="_x0000_s1038" style="position:absolute;visibility:visible;mso-wrap-style:square" from="41572,0" to="41572,45705" o:connectortype="straight" o:gfxdata="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" strokeweight="0"/>
-            <v:line id="Conector recto 1802161604" o:spid="_x0000_s1039" style="position:absolute;flip:x;visibility:visible;mso-wrap-style:square" from="50,45712" to="41616,45712" o:connectortype="straight" o:gfxdata="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" strokeweight="0"/>
-            <v:line id="Conector recto 628566534" o:spid="_x0000_s1040" style="position:absolute;flip:y;visibility:visible;mso-wrap-style:square" from="50,50" to="50,45756" o:connectortype="straight" o:gfxdata="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" strokeweight="0"/>
+            <v:line id="Conector recto 322705081" o:spid="_x0000_s1183" style="position:absolute;visibility:visible;mso-wrap-style:square" from="0,50" to="41565,50" o:connectortype="straight" o:gfxdata="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" strokeweight="0"/>
+            <v:line id="Conector recto 933020994" o:spid="_x0000_s1184" style="position:absolute;visibility:visible;mso-wrap-style:square" from="41572,0" to="41572,45705" o:connectortype="straight" o:gfxdata="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" strokeweight="0"/>
+            <v:line id="Conector recto 1802161604" o:spid="_x0000_s1185" style="position:absolute;flip:x;visibility:visible;mso-wrap-style:square" from="50,45712" to="41616,45712" o:connectortype="straight" o:gfxdata="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" strokeweight="0"/>
+            <v:line id="Conector recto 628566534" o:spid="_x0000_s1186" style="position:absolute;flip:y;visibility:visible;mso-wrap-style:square" from="50,50" to="50,45756" o:connectortype="straight" o:gfxdata="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" strokeweight="0"/>
             <w10:anchorlock/>
           </v:group>
         </w:pict>
@@ -4098,10 +5312,9 @@
       </w:pPr>
       <w:r>
         <w:rPr>
-          <w:rFonts w:ascii="Arial" w:eastAsia="Arial" w:hAnsi="Arial" w:cs="Arial"/>
-          <w:sz w:val="18"/>
-        </w:rPr>
-        <w:t xml:space="preserve">Precios </w:t>
+          <w:rFonts w:ascii="Arial" w:hAnsi="Arial"/>
+        </w:rPr>
+        <w:t>Se relevó información sobre los precios del retiro, permitiendo identificar la necesidad de registrar costos, modalidades de pago y servicios incluidos para facilitar la comparación entre distintas opciones.</w:t>
       </w:r>
     </w:p>
     <w:p>
@@ -4113,15 +5326,10 @@
         </w:rPr>
       </w:pPr>
       <w:r>
-        <w:rPr>
-          <w:noProof/>
-        </w:rPr>
-      </w:r>
-      <w:r>
         <w:pict w14:anchorId="2909002C">
-          <v:group id="Group 14435" o:spid="_x0000_s1026" style="width:458.5pt;height:245.8pt;mso-position-horizontal-relative:char;mso-position-vertical-relative:line" coordsize="58230,31215" o:gfxdata="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">
+          <v:group id="Group 14435" o:spid="_x0000_s1026" style="width:458.5pt;height:245.8pt;mso-position-horizontal-relative:char;mso-position-vertical-relative:line" coordsize="58230,31215">
             <v:shape id="Cuadro de texto 103480568" o:spid="_x0000_s1027" type="#_x0000_t202" style="position:absolute;left:57808;top:27856;width:418;height:1404;visibility:visible;mso-wrap-style:square;v-text-anchor:top" o:gfxdata="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" filled="f" stroked="f" strokeweight="0">
-              <v:textbox inset="0,0,0,0">
+              <v:textbox style="mso-next-textbox:#Cuadro de texto 103480568" inset="0,0,0,0">
                 <w:txbxContent>
                   <w:p>
                     <w:pPr>
@@ -4140,7 +5348,7 @@
               </v:textbox>
             </v:shape>
             <v:shape id="Cuadro de texto 776399003" o:spid="_x0000_s1028" type="#_x0000_t202" style="position:absolute;top:29808;width:417;height:1411;visibility:visible;mso-wrap-style:square;v-text-anchor:top" o:gfxdata="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" filled="f" stroked="f" strokeweight="0">
-              <v:textbox inset="0,0,0,0">
+              <v:textbox style="mso-next-textbox:#Cuadro de texto 776399003" inset="0,0,0,0">
                 <w:txbxContent>
                   <w:p>
                     <w:pPr>
@@ -4190,6 +5398,10 @@
       <w:pPr>
         <w:spacing w:after="0" w:line="240" w:lineRule="auto"/>
         <w:ind w:left="-5" w:right="80" w:hanging="10"/>
+        <w:rPr>
+          <w:rFonts w:ascii="Arial" w:eastAsia="Arial" w:hAnsi="Arial" w:cs="Arial"/>
+          <w:sz w:val="18"/>
+        </w:rPr>
       </w:pPr>
       <w:hyperlink r:id="rId27">
         <w:r>
@@ -4207,7 +5419,7 @@
           <w:rFonts w:ascii="Arial" w:eastAsia="Arial" w:hAnsi="Arial" w:cs="Arial"/>
           <w:sz w:val="18"/>
         </w:rPr>
-        <w:t xml:space="preserve"> Que se incluye: </w:t>
+        <w:t xml:space="preserve"> </w:t>
       </w:r>
     </w:p>
     <w:p>
@@ -4218,6 +5430,13 @@
           <w:rFonts w:ascii="Arial" w:hAnsi="Arial"/>
         </w:rPr>
       </w:pPr>
+      <w:r>
+        <w:rPr>
+          <w:rFonts w:ascii="Arial" w:eastAsia="Arial" w:hAnsi="Arial" w:cs="Arial"/>
+          <w:sz w:val="18"/>
+        </w:rPr>
+        <w:t>Detalla los servicios y beneficios incluidos en la experiencia, tales como alojamiento, alimentación, actividades programadas y materiales necesarios para la participación.</w:t>
+      </w:r>
       <w:r>
         <w:rPr>
           <w:rFonts w:ascii="Arial" w:hAnsi="Arial"/>
@@ -4287,22 +5506,6 @@
     </w:p>
     <w:p>
       <w:pPr>
-        <w:spacing w:after="83" w:line="240" w:lineRule="auto"/>
-        <w:ind w:left="-5" w:hanging="10"/>
-        <w:rPr>
-          <w:rFonts w:ascii="Arial" w:hAnsi="Arial"/>
-        </w:rPr>
-      </w:pPr>
-      <w:r>
-        <w:rPr>
-          <w:rFonts w:ascii="Arial" w:eastAsia="Arial" w:hAnsi="Arial" w:cs="Arial"/>
-          <w:sz w:val="18"/>
-        </w:rPr>
-        <w:t xml:space="preserve">Imagenes retiros anteriores: </w:t>
-      </w:r>
-    </w:p>
-    <w:p>
-      <w:pPr>
         <w:spacing w:after="87" w:line="240" w:lineRule="auto"/>
         <w:jc w:val="right"/>
         <w:rPr>
@@ -4311,10 +5514,17 @@
       </w:pPr>
       <w:r>
         <w:rPr>
+          <w:rFonts w:ascii="Arial" w:eastAsia="Arial" w:hAnsi="Arial" w:cs="Arial"/>
+          <w:sz w:val="18"/>
+        </w:rPr>
+        <w:lastRenderedPageBreak/>
+        <w:t>Presenta una galería de imágenes correspondientes a retiros realizados anteriormente, permitiendo visualizar las instalaciones, actividades desarrolladas y el entorno en el que se llevan a cabo las experiencias.</w:t>
+      </w:r>
+      <w:r>
+        <w:rPr>
           <w:rFonts w:ascii="Arial" w:hAnsi="Arial"/>
           <w:noProof/>
         </w:rPr>
-        <w:lastRenderedPageBreak/>
         <w:drawing>
           <wp:inline distT="0" distB="0" distL="0" distR="0" wp14:anchorId="04D85540" wp14:editId="04D85541">
             <wp:extent cx="5734050" cy="3343275"/>
@@ -4364,28 +5574,19 @@
     </w:p>
     <w:p>
       <w:pPr>
-        <w:spacing w:after="83" w:line="240" w:lineRule="auto"/>
-        <w:ind w:left="-5" w:hanging="10"/>
-        <w:rPr>
-          <w:rFonts w:ascii="Arial" w:hAnsi="Arial"/>
-        </w:rPr>
-      </w:pPr>
-      <w:r>
-        <w:rPr>
-          <w:rFonts w:ascii="Arial" w:eastAsia="Arial" w:hAnsi="Arial" w:cs="Arial"/>
-          <w:sz w:val="18"/>
-        </w:rPr>
-        <w:t xml:space="preserve">Experiencias/Testimonios: </w:t>
-      </w:r>
-    </w:p>
-    <w:p>
-      <w:pPr>
         <w:spacing w:after="87" w:line="240" w:lineRule="auto"/>
         <w:jc w:val="right"/>
         <w:rPr>
           <w:rFonts w:ascii="Arial" w:hAnsi="Arial"/>
         </w:rPr>
       </w:pPr>
+      <w:r>
+        <w:rPr>
+          <w:rFonts w:ascii="Arial" w:eastAsia="Arial" w:hAnsi="Arial" w:cs="Arial"/>
+          <w:sz w:val="18"/>
+        </w:rPr>
+        <w:t>Se relevó una sección de testimonios de participantes, permitiendo identificar la necesidad de registrar valoraciones, comentarios y experiencias asociadas a cada retiro dentro del sistema.</w:t>
+      </w:r>
       <w:r>
         <w:rPr>
           <w:rFonts w:ascii="Arial" w:hAnsi="Arial"/>
@@ -4440,34 +5641,26 @@
     </w:p>
     <w:p>
       <w:pPr>
-        <w:spacing w:after="83" w:line="240" w:lineRule="auto"/>
-        <w:ind w:left="-5" w:hanging="10"/>
-        <w:rPr>
-          <w:rFonts w:ascii="Arial" w:hAnsi="Arial"/>
-        </w:rPr>
-      </w:pPr>
-      <w:r>
-        <w:rPr>
-          <w:rFonts w:ascii="Arial" w:eastAsia="Arial" w:hAnsi="Arial" w:cs="Arial"/>
-          <w:sz w:val="18"/>
-        </w:rPr>
-        <w:t xml:space="preserve">Información de las organizadoras: </w:t>
-      </w:r>
-    </w:p>
-    <w:p>
-      <w:pPr>
         <w:spacing w:after="87" w:line="240" w:lineRule="auto"/>
         <w:jc w:val="right"/>
         <w:rPr>
-          <w:rFonts w:ascii="Arial" w:hAnsi="Arial"/>
-        </w:rPr>
-      </w:pPr>
+          <w:rFonts w:ascii="Arial" w:eastAsia="Arial" w:hAnsi="Arial" w:cs="Arial"/>
+          <w:sz w:val="18"/>
+        </w:rPr>
+      </w:pPr>
+      <w:r>
+        <w:rPr>
+          <w:rFonts w:ascii="Arial" w:eastAsia="Arial" w:hAnsi="Arial" w:cs="Arial"/>
+          <w:sz w:val="18"/>
+        </w:rPr>
+        <w:lastRenderedPageBreak/>
+        <w:t>Presenta información sobre las personas responsables de la organización y coordinación del retiro, incluyendo su experiencia, formación y rol dentro de las actividades propuestas.</w:t>
+      </w:r>
       <w:r>
         <w:rPr>
           <w:rFonts w:ascii="Arial" w:hAnsi="Arial"/>
           <w:noProof/>
         </w:rPr>
-        <w:lastRenderedPageBreak/>
         <w:drawing>
           <wp:inline distT="0" distB="0" distL="0" distR="0" wp14:anchorId="04D85544" wp14:editId="04D85545">
             <wp:extent cx="5734050" cy="3362325"/>
@@ -4517,18 +5710,17 @@
     </w:p>
     <w:p>
       <w:pPr>
-        <w:spacing w:after="83" w:line="240" w:lineRule="auto"/>
-        <w:ind w:left="-5" w:hanging="10"/>
-        <w:rPr>
-          <w:rFonts w:ascii="Arial" w:hAnsi="Arial"/>
-        </w:rPr>
-      </w:pPr>
-      <w:r>
-        <w:rPr>
-          <w:rFonts w:ascii="Arial" w:eastAsia="Arial" w:hAnsi="Arial" w:cs="Arial"/>
-          <w:sz w:val="18"/>
-        </w:rPr>
-        <w:t xml:space="preserve">Fecha, lugar y valor: </w:t>
+        <w:spacing w:after="87" w:line="240" w:lineRule="auto"/>
+        <w:jc w:val="right"/>
+        <w:rPr>
+          <w:rFonts w:ascii="Arial" w:hAnsi="Arial"/>
+        </w:rPr>
+      </w:pPr>
+      <w:r>
+        <w:rPr>
+          <w:rFonts w:ascii="Arial" w:hAnsi="Arial"/>
+        </w:rPr>
+        <w:t>Se relevó información sobre fechas, ubicación y costo del retiro, permitiendo identificar la necesidad de registrar estos datos para facilitar la organización, consulta y comparación de diferentes propuestas.</w:t>
       </w:r>
     </w:p>
     <w:p>
@@ -4594,22 +5786,6 @@
     </w:p>
     <w:p>
       <w:pPr>
-        <w:spacing w:after="83" w:line="240" w:lineRule="auto"/>
-        <w:ind w:left="-5" w:hanging="10"/>
-        <w:rPr>
-          <w:rFonts w:ascii="Arial" w:hAnsi="Arial"/>
-        </w:rPr>
-      </w:pPr>
-      <w:r>
-        <w:rPr>
-          <w:rFonts w:ascii="Arial" w:eastAsia="Arial" w:hAnsi="Arial" w:cs="Arial"/>
-          <w:sz w:val="18"/>
-        </w:rPr>
-        <w:t xml:space="preserve">Formas de pago: </w:t>
-      </w:r>
-    </w:p>
-    <w:p>
-      <w:pPr>
         <w:spacing w:after="87" w:line="240" w:lineRule="auto"/>
         <w:jc w:val="right"/>
         <w:rPr>
@@ -4618,10 +5794,17 @@
       </w:pPr>
       <w:r>
         <w:rPr>
+          <w:rFonts w:ascii="Arial" w:eastAsia="Arial" w:hAnsi="Arial" w:cs="Arial"/>
+          <w:sz w:val="18"/>
+        </w:rPr>
+        <w:lastRenderedPageBreak/>
+        <w:t>Detalla las modalidades y medios de pago disponibles para la contratación del retiro, incluyendo opciones de transferencia, efectivo, cuotas u otros mecanismos habilitados por la organización.</w:t>
+      </w:r>
+      <w:r>
+        <w:rPr>
           <w:rFonts w:ascii="Arial" w:hAnsi="Arial"/>
           <w:noProof/>
         </w:rPr>
-        <w:lastRenderedPageBreak/>
         <w:drawing>
           <wp:inline distT="0" distB="0" distL="0" distR="0" wp14:anchorId="04D85548" wp14:editId="04D85549">
             <wp:extent cx="5734050" cy="3124200"/>
@@ -4749,28 +5932,19 @@
     </w:p>
     <w:p>
       <w:pPr>
-        <w:spacing w:after="83" w:line="240" w:lineRule="auto"/>
-        <w:ind w:left="-5" w:hanging="10"/>
-        <w:rPr>
-          <w:rFonts w:ascii="Arial" w:hAnsi="Arial"/>
-        </w:rPr>
-      </w:pPr>
-      <w:r>
-        <w:rPr>
-          <w:rFonts w:ascii="Arial" w:eastAsia="Arial" w:hAnsi="Arial" w:cs="Arial"/>
-          <w:sz w:val="18"/>
-        </w:rPr>
-        <w:t xml:space="preserve">Info. sobre propuestas: </w:t>
-      </w:r>
-    </w:p>
-    <w:p>
-      <w:pPr>
         <w:spacing w:after="87" w:line="240" w:lineRule="auto"/>
         <w:jc w:val="right"/>
         <w:rPr>
           <w:rFonts w:ascii="Arial" w:hAnsi="Arial"/>
         </w:rPr>
       </w:pPr>
+      <w:r>
+        <w:rPr>
+          <w:rFonts w:ascii="Arial" w:eastAsia="Arial" w:hAnsi="Arial" w:cs="Arial"/>
+          <w:sz w:val="18"/>
+        </w:rPr>
+        <w:t>Presenta información detallada sobre las distintas propuestas y programas ofrecidos, incluyendo sus características, objetivos, actividades y condiciones de participación.</w:t>
+      </w:r>
       <w:r>
         <w:rPr>
           <w:rFonts w:ascii="Arial" w:hAnsi="Arial"/>
@@ -4896,7 +6070,6 @@
     <w:sectPr>
       <w:footerReference w:type="even" r:id="rId37"/>
       <w:footerReference w:type="default" r:id="rId38"/>
-      <w:footerReference w:type="first" r:id="rId39"/>
       <w:pgSz w:w="11906" w:h="16838"/>
       <w:pgMar w:top="1470" w:right="1340" w:bottom="777" w:left="1440" w:header="0" w:footer="720" w:gutter="0"/>
       <w:pgNumType w:start="0"/>
@@ -5085,12 +6258,6 @@
       <w:t xml:space="preserve"> </w:t>
     </w:r>
   </w:p>
-</w:ftr>
-</file>
-
-<file path=word/footer3.xml><?xml version="1.0" encoding="utf-8"?>
-<w:ftr xmlns:wpc="http://schemas.microsoft.com/office/word/2010/wordprocessingCanvas" xmlns:cx="http://schemas.microsoft.com/office/drawing/2014/chartex" xmlns:cx1="http://schemas.microsoft.com/office/drawing/2015/9/8/chartex" xmlns:cx2="http://schemas.microsoft.com/office/drawing/2015/10/21/chartex" xmlns:cx3="http://schemas.microsoft.com/office/drawing/2016/5/9/chartex" xmlns:cx4="http://schemas.microsoft.com/office/drawing/2016/5/10/chartex" xmlns:cx5="http://schemas.microsoft.com/office/drawing/2016/5/11/chartex" xmlns:cx6="http://schemas.microsoft.com/office/drawing/2016/5/12/chartex" xmlns:cx7="http://schemas.microsoft.com/office/drawing/2016/5/13/chartex" xmlns:cx8="http://schemas.microsoft.com/office/drawing/2016/5/14/chartex" xmlns:mc="http://schemas.openxmlformats.org/markup-compatibility/2006" xmlns:aink="http://schemas.microsoft.com/office/drawing/2016/ink" xmlns:am3d="http://schemas.microsoft.com/office/drawing/2017/model3d" xmlns:o="urn:schemas-microsoft-com:office:office" xmlns:oel="http://schemas.microsoft.com/office/2019/extlst" xmlns:r="http://schemas.openxmlformats.org/officeDocument/2006/relationships" xmlns:m="http://schemas.openxmlformats.org/officeDocument/2006/math" xmlns:v="urn:schemas-microsoft-com:vml" xmlns:wp14="http://schemas.microsoft.com/office/word/2010/wordprocessingDrawing" xmlns:wp="http://schemas.openxmlformats.org/drawingml/2006/wordprocessingDrawing" xmlns:w10="urn:schemas-microsoft-com:office:word" xmlns:w="http://schemas.openxmlformats.org/wordprocessingml/2006/main" xmlns:w14="http://schemas.microsoft.com/office/word/2010/wordml" xmlns:w15="http://schemas.microsoft.com/office/word/2012/wordml" xmlns:w16cex="http://schemas.microsoft.com/office/word/2018/wordml/cex" xmlns:w16cid="http://schemas.microsoft.com/office/word/2016/wordml/cid" xmlns:w16="http://schemas.microsoft.com/office/word/2018/wordml" xmlns:w16du="http://schemas.microsoft.com/office/word/2023/wordml/word16du" xmlns:w16sdtdh="http://schemas.microsoft.com/office/word/2020/wordml/sdtdatahash" xmlns:w16sdtfl="http://schemas.microsoft.com/office/word/2024/wordml/sdtformatlock" xmlns:w16se="http://schemas.microsoft.com/office/word/2015/wordml/symex" xmlns:wpg="http://schemas.microsoft.com/office/word/2010/wordprocessingGroup" xmlns:wpi="http://schemas.microsoft.com/office/word/2010/wordprocessingInk" xmlns:wne="http://schemas.microsoft.com/office/word/2006/wordml" xmlns:wps="http://schemas.microsoft.com/office/word/2010/wordprocessingShape" mc:Ignorable="w14 w15 w16se w16cid w16 w16cex w16sdtdh w16sdtfl w16du wp14">
-  <w:p/>
 </w:ftr>
 </file>
 
@@ -6618,6 +7785,33 @@
       <w:sz w:val="24"/>
     </w:rPr>
   </w:style>
+  <w:style w:type="paragraph" w:styleId="Encabezado">
+    <w:name w:val="header"/>
+    <w:basedOn w:val="Normal"/>
+    <w:link w:val="EncabezadoCar"/>
+    <w:uiPriority w:val="99"/>
+    <w:unhideWhenUsed/>
+    <w:rsid w:val="00A76875"/>
+    <w:pPr>
+      <w:tabs>
+        <w:tab w:val="center" w:pos="4252"/>
+        <w:tab w:val="right" w:pos="8504"/>
+      </w:tabs>
+      <w:spacing w:after="0" w:line="240" w:lineRule="auto"/>
+    </w:pPr>
+  </w:style>
+  <w:style w:type="character" w:customStyle="1" w:styleId="EncabezadoCar">
+    <w:name w:val="Encabezado Car"/>
+    <w:basedOn w:val="Fuentedeprrafopredeter"/>
+    <w:link w:val="Encabezado"/>
+    <w:uiPriority w:val="99"/>
+    <w:rsid w:val="00A76875"/>
+    <w:rPr>
+      <w:rFonts w:ascii="Calibri" w:eastAsia="Calibri" w:hAnsi="Calibri" w:cs="Calibri"/>
+      <w:color w:val="000000"/>
+      <w:sz w:val="22"/>
+    </w:rPr>
+  </w:style>
 </w:styles>
 </file>
 

</xml_diff>